<commit_message>
Add and update SQL documentation files
Added new documents: 'INDEX Storage on DISK.docx' and 'JOIN_SQL_2.docx'. Updated existing SQL guides and reference files to include new content and revisions.
</commit_message>
<xml_diff>
--- a/SQL Learning Guide.docx
+++ b/SQL Learning Guide.docx
@@ -6007,18 +6007,32 @@
     <w:p>
       <w:pPr>
         <w:spacing w:after="210"/>
-      </w:pPr>
-      <w:r>
+        <w:rPr>
+          <w:rFonts w:asciiTheme="minorHAnsi" w:cstheme="minorHAnsi"/>
+        </w:rPr>
+      </w:pPr>
+      <w:r>
+        <w:rPr>
+          <w:rFonts w:asciiTheme="minorHAnsi" w:cstheme="minorHAnsi"/>
+        </w:rPr>
         <w:t>SELECT * FROM employees</w:t>
       </w:r>
       <w:r>
+        <w:rPr>
+          <w:rFonts w:asciiTheme="minorHAnsi" w:cstheme="minorHAnsi"/>
+        </w:rPr>
         <w:br/>
         <w:t>WHERE (department = 'IT' OR department = 'HR')</w:t>
       </w:r>
       <w:r>
+        <w:rPr>
+          <w:rFonts w:asciiTheme="minorHAnsi" w:cstheme="minorHAnsi"/>
+        </w:rPr>
         <w:br/>
         <w:t>AND salary &gt; 50000;</w:t>
       </w:r>
+      <w:bookmarkStart w:id="58" w:name="_GoBack"/>
+      <w:bookmarkEnd w:id="58"/>
     </w:p>
     <w:p>
       <w:pPr>
@@ -6050,7 +6064,7 @@
       <w:pPr>
         <w:spacing w:before="240" w:line="288" w:lineRule="auto"/>
       </w:pPr>
-      <w:bookmarkStart w:id="58" w:name="chapter_7_aggregations_grouping"/>
+      <w:bookmarkStart w:id="59" w:name="chapter_7_aggregations_grouping"/>
       <w:r>
         <w:rPr>
           <w:b/>
@@ -6058,13 +6072,13 @@
         </w:rPr>
         <w:t>Chapter 7: Aggregations &amp; Grouping</w:t>
       </w:r>
-      <w:bookmarkEnd w:id="58"/>
+      <w:bookmarkEnd w:id="59"/>
     </w:p>
     <w:p>
       <w:pPr>
         <w:spacing w:before="240" w:line="271" w:lineRule="auto"/>
       </w:pPr>
-      <w:bookmarkStart w:id="59" w:name="aggregate_functions"/>
+      <w:bookmarkStart w:id="60" w:name="aggregate_functions"/>
       <w:r>
         <w:rPr>
           <w:b/>
@@ -6072,7 +6086,7 @@
         </w:rPr>
         <w:t>Aggregate Functions</w:t>
       </w:r>
-      <w:bookmarkEnd w:id="59"/>
+      <w:bookmarkEnd w:id="60"/>
     </w:p>
     <w:p>
       <w:pPr>
@@ -6086,7 +6100,7 @@
       <w:pPr>
         <w:spacing w:before="240" w:line="271" w:lineRule="auto"/>
       </w:pPr>
-      <w:bookmarkStart w:id="60" w:name="count"/>
+      <w:bookmarkStart w:id="61" w:name="count"/>
       <w:r>
         <w:rPr>
           <w:b/>
@@ -6094,7 +6108,7 @@
         </w:rPr>
         <w:t>COUNT</w:t>
       </w:r>
-      <w:bookmarkEnd w:id="60"/>
+      <w:bookmarkEnd w:id="61"/>
     </w:p>
     <w:p>
       <w:pPr>
@@ -6144,7 +6158,7 @@
       <w:pPr>
         <w:spacing w:before="240" w:line="271" w:lineRule="auto"/>
       </w:pPr>
-      <w:bookmarkStart w:id="61" w:name="sum"/>
+      <w:bookmarkStart w:id="62" w:name="sum"/>
       <w:r>
         <w:rPr>
           <w:b/>
@@ -6153,7 +6167,7 @@
         <w:lastRenderedPageBreak/>
         <w:t>SUM</w:t>
       </w:r>
-      <w:bookmarkEnd w:id="61"/>
+      <w:bookmarkEnd w:id="62"/>
     </w:p>
     <w:p>
       <w:pPr>
@@ -6191,7 +6205,7 @@
       <w:pPr>
         <w:spacing w:before="240" w:line="271" w:lineRule="auto"/>
       </w:pPr>
-      <w:bookmarkStart w:id="62" w:name="avg"/>
+      <w:bookmarkStart w:id="63" w:name="avg"/>
       <w:r>
         <w:rPr>
           <w:b/>
@@ -6199,7 +6213,7 @@
         </w:rPr>
         <w:t>AVG</w:t>
       </w:r>
-      <w:bookmarkEnd w:id="62"/>
+      <w:bookmarkEnd w:id="63"/>
     </w:p>
     <w:p>
       <w:pPr>
@@ -6245,7 +6259,7 @@
       <w:pPr>
         <w:spacing w:before="240" w:line="271" w:lineRule="auto"/>
       </w:pPr>
-      <w:bookmarkStart w:id="63" w:name="min_and_max"/>
+      <w:bookmarkStart w:id="64" w:name="min_and_max"/>
       <w:r>
         <w:rPr>
           <w:b/>
@@ -6253,7 +6267,7 @@
         </w:rPr>
         <w:t>MIN and MAX</w:t>
       </w:r>
-      <w:bookmarkEnd w:id="63"/>
+      <w:bookmarkEnd w:id="64"/>
     </w:p>
     <w:p>
       <w:pPr>
@@ -6299,7 +6313,7 @@
       <w:pPr>
         <w:spacing w:before="240" w:line="271" w:lineRule="auto"/>
       </w:pPr>
-      <w:bookmarkStart w:id="64" w:name="group_by_clause"/>
+      <w:bookmarkStart w:id="65" w:name="group_by_clause"/>
       <w:r>
         <w:rPr>
           <w:b/>
@@ -6307,7 +6321,7 @@
         </w:rPr>
         <w:t>GROUP BY Clause</w:t>
       </w:r>
-      <w:bookmarkEnd w:id="64"/>
+      <w:bookmarkEnd w:id="65"/>
     </w:p>
     <w:p>
       <w:pPr>
@@ -6464,7 +6478,7 @@
       <w:pPr>
         <w:spacing w:before="240" w:line="271" w:lineRule="auto"/>
       </w:pPr>
-      <w:bookmarkStart w:id="65" w:name="having_clause"/>
+      <w:bookmarkStart w:id="66" w:name="having_clause"/>
       <w:r>
         <w:rPr>
           <w:b/>
@@ -6472,7 +6486,7 @@
         </w:rPr>
         <w:t>HAVING Clause</w:t>
       </w:r>
-      <w:bookmarkEnd w:id="65"/>
+      <w:bookmarkEnd w:id="66"/>
     </w:p>
     <w:p>
       <w:pPr>
@@ -6602,7 +6616,7 @@
       <w:pPr>
         <w:spacing w:before="240" w:line="271" w:lineRule="auto"/>
       </w:pPr>
-      <w:bookmarkStart w:id="66" w:name="complete_example_sales_analysis"/>
+      <w:bookmarkStart w:id="67" w:name="complete_example_sales_analysis"/>
       <w:r>
         <w:rPr>
           <w:b/>
@@ -6610,7 +6624,7 @@
         </w:rPr>
         <w:t>Complete Example: Sales Analysis</w:t>
       </w:r>
-      <w:bookmarkEnd w:id="66"/>
+      <w:bookmarkEnd w:id="67"/>
     </w:p>
     <w:p>
       <w:pPr>
@@ -6744,7 +6758,7 @@
       <w:pPr>
         <w:spacing w:before="240" w:line="271" w:lineRule="auto"/>
       </w:pPr>
-      <w:bookmarkStart w:id="67" w:name="common_mistakes"/>
+      <w:bookmarkStart w:id="68" w:name="common_mistakes"/>
       <w:r>
         <w:rPr>
           <w:b/>
@@ -6752,7 +6766,7 @@
         </w:rPr>
         <w:t>Common Mistakes</w:t>
       </w:r>
-      <w:bookmarkEnd w:id="67"/>
+      <w:bookmarkEnd w:id="68"/>
     </w:p>
     <w:p>
       <w:pPr>
@@ -6963,7 +6977,7 @@
       <w:pPr>
         <w:spacing w:before="240" w:line="288" w:lineRule="auto"/>
       </w:pPr>
-      <w:bookmarkStart w:id="68" w:name="chapter_8_joins_relationships"/>
+      <w:bookmarkStart w:id="69" w:name="chapter_8_joins_relationships"/>
       <w:r>
         <w:rPr>
           <w:b/>
@@ -6971,13 +6985,13 @@
         </w:rPr>
         <w:t>Chapter 8: Joins &amp; Relationships</w:t>
       </w:r>
-      <w:bookmarkEnd w:id="68"/>
+      <w:bookmarkEnd w:id="69"/>
     </w:p>
     <w:p>
       <w:pPr>
         <w:spacing w:before="240" w:line="271" w:lineRule="auto"/>
       </w:pPr>
-      <w:bookmarkStart w:id="69" w:name="understanding_table_relationships"/>
+      <w:bookmarkStart w:id="70" w:name="understanding_table_relationships"/>
       <w:r>
         <w:rPr>
           <w:b/>
@@ -6985,7 +6999,7 @@
         </w:rPr>
         <w:t>Understanding Table Relationships</w:t>
       </w:r>
-      <w:bookmarkEnd w:id="69"/>
+      <w:bookmarkEnd w:id="70"/>
     </w:p>
     <w:p>
       <w:pPr>
@@ -7102,7 +7116,7 @@
       <w:pPr>
         <w:spacing w:before="240" w:line="271" w:lineRule="auto"/>
       </w:pPr>
-      <w:bookmarkStart w:id="70" w:name="inner_join"/>
+      <w:bookmarkStart w:id="71" w:name="inner_join"/>
       <w:r>
         <w:rPr>
           <w:b/>
@@ -7110,7 +7124,7 @@
         </w:rPr>
         <w:t>INNER JOIN</w:t>
       </w:r>
-      <w:bookmarkEnd w:id="70"/>
+      <w:bookmarkEnd w:id="71"/>
     </w:p>
     <w:p>
       <w:pPr>
@@ -7218,7 +7232,7 @@
       <w:pPr>
         <w:spacing w:before="240" w:line="271" w:lineRule="auto"/>
       </w:pPr>
-      <w:bookmarkStart w:id="71" w:name="left_join"/>
+      <w:bookmarkStart w:id="72" w:name="left_join"/>
       <w:r>
         <w:rPr>
           <w:b/>
@@ -7227,7 +7241,7 @@
         <w:lastRenderedPageBreak/>
         <w:t>LEFT JOIN</w:t>
       </w:r>
-      <w:bookmarkEnd w:id="71"/>
+      <w:bookmarkEnd w:id="72"/>
     </w:p>
     <w:p>
       <w:pPr>
@@ -7335,7 +7349,7 @@
       <w:pPr>
         <w:spacing w:before="240" w:line="271" w:lineRule="auto"/>
       </w:pPr>
-      <w:bookmarkStart w:id="72" w:name="right_join"/>
+      <w:bookmarkStart w:id="73" w:name="right_join"/>
       <w:r>
         <w:rPr>
           <w:b/>
@@ -7343,7 +7357,7 @@
         </w:rPr>
         <w:t>RIGHT JOIN</w:t>
       </w:r>
-      <w:bookmarkEnd w:id="72"/>
+      <w:bookmarkEnd w:id="73"/>
     </w:p>
     <w:p>
       <w:pPr>
@@ -7415,7 +7429,7 @@
       <w:pPr>
         <w:spacing w:before="240" w:line="271" w:lineRule="auto"/>
       </w:pPr>
-      <w:bookmarkStart w:id="73" w:name="full_join"/>
+      <w:bookmarkStart w:id="74" w:name="full_join"/>
       <w:r>
         <w:rPr>
           <w:b/>
@@ -7423,7 +7437,7 @@
         </w:rPr>
         <w:t>FULL JOIN</w:t>
       </w:r>
-      <w:bookmarkEnd w:id="73"/>
+      <w:bookmarkEnd w:id="74"/>
     </w:p>
     <w:p>
       <w:pPr>
@@ -7495,7 +7509,7 @@
       <w:pPr>
         <w:spacing w:before="240" w:line="271" w:lineRule="auto"/>
       </w:pPr>
-      <w:bookmarkStart w:id="74" w:name="self_join"/>
+      <w:bookmarkStart w:id="75" w:name="self_join"/>
       <w:r>
         <w:rPr>
           <w:b/>
@@ -7503,7 +7517,7 @@
         </w:rPr>
         <w:t>SELF JOIN</w:t>
       </w:r>
-      <w:bookmarkEnd w:id="74"/>
+      <w:bookmarkEnd w:id="75"/>
     </w:p>
     <w:p>
       <w:pPr>
@@ -7582,7 +7596,7 @@
       <w:pPr>
         <w:spacing w:before="240" w:line="271" w:lineRule="auto"/>
       </w:pPr>
-      <w:bookmarkStart w:id="75" w:name="join_use_cases"/>
+      <w:bookmarkStart w:id="76" w:name="join_use_cases"/>
       <w:r>
         <w:rPr>
           <w:b/>
@@ -7590,7 +7604,7 @@
         </w:rPr>
         <w:t>Join Use Cases</w:t>
       </w:r>
-      <w:bookmarkEnd w:id="75"/>
+      <w:bookmarkEnd w:id="76"/>
     </w:p>
     <w:p>
       <w:pPr>
@@ -7781,7 +7795,7 @@
       <w:pPr>
         <w:spacing w:before="240" w:line="288" w:lineRule="auto"/>
       </w:pPr>
-      <w:bookmarkStart w:id="76" w:name="chapter_9_subqueries_ctes"/>
+      <w:bookmarkStart w:id="77" w:name="chapter_9_subqueries_ctes"/>
       <w:r>
         <w:rPr>
           <w:b/>
@@ -7789,13 +7803,13 @@
         </w:rPr>
         <w:t>Chapter 9: Subqueries &amp; CTEs</w:t>
       </w:r>
-      <w:bookmarkEnd w:id="76"/>
+      <w:bookmarkEnd w:id="77"/>
     </w:p>
     <w:p>
       <w:pPr>
         <w:spacing w:before="240" w:line="271" w:lineRule="auto"/>
       </w:pPr>
-      <w:bookmarkStart w:id="77" w:name="subqueries"/>
+      <w:bookmarkStart w:id="78" w:name="subqueries"/>
       <w:r>
         <w:rPr>
           <w:b/>
@@ -7803,7 +7817,7 @@
         </w:rPr>
         <w:t>Subqueries</w:t>
       </w:r>
-      <w:bookmarkEnd w:id="77"/>
+      <w:bookmarkEnd w:id="78"/>
     </w:p>
     <w:p>
       <w:pPr>
@@ -7871,7 +7885,7 @@
       <w:pPr>
         <w:spacing w:before="240" w:line="271" w:lineRule="auto"/>
       </w:pPr>
-      <w:bookmarkStart w:id="78" w:name="non_correlated_subqueries"/>
+      <w:bookmarkStart w:id="79" w:name="non_correlated_subqueries"/>
       <w:r>
         <w:rPr>
           <w:b/>
@@ -7880,7 +7894,7 @@
         <w:lastRenderedPageBreak/>
         <w:t>Non-Correlated Subqueries</w:t>
       </w:r>
-      <w:bookmarkEnd w:id="78"/>
+      <w:bookmarkEnd w:id="79"/>
     </w:p>
     <w:p>
       <w:pPr>
@@ -8000,7 +8014,7 @@
       <w:pPr>
         <w:spacing w:before="240" w:line="271" w:lineRule="auto"/>
       </w:pPr>
-      <w:bookmarkStart w:id="79" w:name="correlated_subqueries"/>
+      <w:bookmarkStart w:id="80" w:name="correlated_subqueries"/>
       <w:r>
         <w:rPr>
           <w:b/>
@@ -8008,7 +8022,7 @@
         </w:rPr>
         <w:t>Correlated Subqueries</w:t>
       </w:r>
-      <w:bookmarkEnd w:id="79"/>
+      <w:bookmarkEnd w:id="80"/>
     </w:p>
     <w:p>
       <w:pPr>
@@ -8077,7 +8091,7 @@
       <w:pPr>
         <w:spacing w:before="240" w:line="271" w:lineRule="auto"/>
       </w:pPr>
-      <w:bookmarkStart w:id="80" w:name="ctes_common_table_expressions_wit_eeea02"/>
+      <w:bookmarkStart w:id="81" w:name="ctes_common_table_expressions_wit_eeea02"/>
       <w:r>
         <w:rPr>
           <w:b/>
@@ -8085,7 +8099,7 @@
         </w:rPr>
         <w:t>CTEs (Common Table Expressions) - WITH Clause</w:t>
       </w:r>
-      <w:bookmarkEnd w:id="80"/>
+      <w:bookmarkEnd w:id="81"/>
     </w:p>
     <w:p>
       <w:pPr>
@@ -8157,44 +8171,68 @@
     <w:p>
       <w:pPr>
         <w:spacing w:after="210"/>
-      </w:pPr>
-      <w:r>
-        <w:rPr>
-          <w:rFonts w:eastAsia="Georgia" w:hAnsi="Georgia" w:cs="Georgia"/>
+        <w:rPr>
+          <w:rFonts w:asciiTheme="minorHAnsi" w:cstheme="minorHAnsi"/>
+        </w:rPr>
+      </w:pPr>
+      <w:r>
+        <w:rPr>
+          <w:rFonts w:asciiTheme="minorHAnsi" w:eastAsia="Georgia" w:cstheme="minorHAnsi"/>
         </w:rPr>
         <w:lastRenderedPageBreak/>
         <w:t>WITH high_earners AS (</w:t>
       </w:r>
       <w:r>
+        <w:rPr>
+          <w:rFonts w:asciiTheme="minorHAnsi" w:cstheme="minorHAnsi"/>
+        </w:rPr>
         <w:br/>
         <w:t>SELECT name, salary</w:t>
       </w:r>
       <w:r>
+        <w:rPr>
+          <w:rFonts w:asciiTheme="minorHAnsi" w:cstheme="minorHAnsi"/>
+        </w:rPr>
         <w:br/>
         <w:t>FROM employees</w:t>
       </w:r>
       <w:r>
+        <w:rPr>
+          <w:rFonts w:asciiTheme="minorHAnsi" w:cstheme="minorHAnsi"/>
+        </w:rPr>
         <w:br/>
         <w:t>WHERE salary &gt; 60000</w:t>
       </w:r>
       <w:r>
+        <w:rPr>
+          <w:rFonts w:asciiTheme="minorHAnsi" w:cstheme="minorHAnsi"/>
+        </w:rPr>
         <w:br/>
         <w:t>)</w:t>
       </w:r>
       <w:r>
+        <w:rPr>
+          <w:rFonts w:asciiTheme="minorHAnsi" w:cstheme="minorHAnsi"/>
+        </w:rPr>
         <w:br/>
         <w:t>SELECT name, salary</w:t>
       </w:r>
       <w:r>
-        <w:br/>
-      </w:r>
-      <w:r>
-        <w:rPr>
-          <w:rFonts w:eastAsia="Georgia" w:hAnsi="Georgia" w:cs="Georgia"/>
+        <w:rPr>
+          <w:rFonts w:asciiTheme="minorHAnsi" w:cstheme="minorHAnsi"/>
+        </w:rPr>
+        <w:br/>
+      </w:r>
+      <w:r>
+        <w:rPr>
+          <w:rFonts w:asciiTheme="minorHAnsi" w:eastAsia="Georgia" w:cstheme="minorHAnsi"/>
         </w:rPr>
         <w:t>FROM high_earners</w:t>
       </w:r>
       <w:r>
+        <w:rPr>
+          <w:rFonts w:asciiTheme="minorHAnsi" w:cstheme="minorHAnsi"/>
+        </w:rPr>
         <w:br/>
         <w:t>ORDER BY salary DESC;</w:t>
       </w:r>
@@ -8213,46 +8251,65 @@
     <w:p>
       <w:pPr>
         <w:spacing w:after="210"/>
-      </w:pPr>
-      <w:r>
-        <w:rPr>
-          <w:rFonts w:eastAsia="Georgia" w:hAnsi="Georgia" w:cs="Georgia"/>
+        <w:rPr>
+          <w:rFonts w:asciiTheme="minorHAnsi" w:cstheme="minorHAnsi"/>
+        </w:rPr>
+      </w:pPr>
+      <w:r>
+        <w:rPr>
+          <w:rFonts w:asciiTheme="minorHAnsi" w:eastAsia="Georgia" w:cstheme="minorHAnsi"/>
         </w:rPr>
         <w:t>WITH dept_avg AS (</w:t>
       </w:r>
       <w:r>
-        <w:br/>
-      </w:r>
-      <w:r>
-        <w:rPr>
-          <w:rFonts w:eastAsia="Georgia" w:hAnsi="Georgia" w:cs="Georgia"/>
+        <w:rPr>
+          <w:rFonts w:asciiTheme="minorHAnsi" w:cstheme="minorHAnsi"/>
+        </w:rPr>
+        <w:br/>
+      </w:r>
+      <w:r>
+        <w:rPr>
+          <w:rFonts w:asciiTheme="minorHAnsi" w:eastAsia="Georgia" w:cstheme="minorHAnsi"/>
         </w:rPr>
         <w:t>SELECT department_id, AVG(salary) AS avg_sal</w:t>
       </w:r>
       <w:r>
+        <w:rPr>
+          <w:rFonts w:asciiTheme="minorHAnsi" w:cstheme="minorHAnsi"/>
+        </w:rPr>
         <w:br/>
         <w:t>FROM employees</w:t>
       </w:r>
       <w:r>
-        <w:br/>
-      </w:r>
-      <w:r>
-        <w:rPr>
-          <w:rFonts w:eastAsia="Georgia" w:hAnsi="Georgia" w:cs="Georgia"/>
+        <w:rPr>
+          <w:rFonts w:asciiTheme="minorHAnsi" w:cstheme="minorHAnsi"/>
+        </w:rPr>
+        <w:br/>
+      </w:r>
+      <w:r>
+        <w:rPr>
+          <w:rFonts w:asciiTheme="minorHAnsi" w:eastAsia="Georgia" w:cstheme="minorHAnsi"/>
         </w:rPr>
         <w:t>GROUP BY department_id</w:t>
       </w:r>
       <w:r>
+        <w:rPr>
+          <w:rFonts w:asciiTheme="minorHAnsi" w:cstheme="minorHAnsi"/>
+        </w:rPr>
         <w:br/>
         <w:t>)</w:t>
       </w:r>
       <w:r>
+        <w:rPr>
+          <w:rFonts w:asciiTheme="minorHAnsi" w:cstheme="minorHAnsi"/>
+        </w:rPr>
         <w:br/>
         <w:t xml:space="preserve">SELECT </w:t>
       </w:r>
       <w:hyperlink r:id="rId22">
         <w:r>
           <w:rPr>
+            <w:rFonts w:asciiTheme="minorHAnsi" w:cstheme="minorHAnsi"/>
             <w:color w:val="4472C4"/>
           </w:rPr>
           <w:t>e.name</w:t>
@@ -8260,29 +8317,38 @@
       </w:hyperlink>
       <w:r>
         <w:rPr>
-          <w:rFonts w:eastAsia="Georgia" w:hAnsi="Georgia" w:cs="Georgia"/>
+          <w:rFonts w:asciiTheme="minorHAnsi" w:eastAsia="Georgia" w:cstheme="minorHAnsi"/>
         </w:rPr>
         <w:t>, e.salary, da.avg_sal</w:t>
       </w:r>
       <w:r>
+        <w:rPr>
+          <w:rFonts w:asciiTheme="minorHAnsi" w:cstheme="minorHAnsi"/>
+        </w:rPr>
         <w:br/>
         <w:t>FROM employees e</w:t>
       </w:r>
       <w:r>
-        <w:br/>
-      </w:r>
-      <w:r>
-        <w:rPr>
-          <w:rFonts w:eastAsia="Georgia" w:hAnsi="Georgia" w:cs="Georgia"/>
+        <w:rPr>
+          <w:rFonts w:asciiTheme="minorHAnsi" w:cstheme="minorHAnsi"/>
+        </w:rPr>
+        <w:br/>
+      </w:r>
+      <w:r>
+        <w:rPr>
+          <w:rFonts w:asciiTheme="minorHAnsi" w:eastAsia="Georgia" w:cstheme="minorHAnsi"/>
         </w:rPr>
         <w:t>JOIN dept_avg da ON e.department_id = da.department_id</w:t>
       </w:r>
       <w:r>
-        <w:br/>
-      </w:r>
-      <w:r>
-        <w:rPr>
-          <w:rFonts w:eastAsia="Georgia" w:hAnsi="Georgia" w:cs="Georgia"/>
+        <w:rPr>
+          <w:rFonts w:asciiTheme="minorHAnsi" w:cstheme="minorHAnsi"/>
+        </w:rPr>
+        <w:br/>
+      </w:r>
+      <w:r>
+        <w:rPr>
+          <w:rFonts w:asciiTheme="minorHAnsi" w:eastAsia="Georgia" w:cstheme="minorHAnsi"/>
         </w:rPr>
         <w:t>WHERE e.salary &gt; da.avg_sal;</w:t>
       </w:r>
@@ -8301,75 +8367,108 @@
     <w:p>
       <w:pPr>
         <w:spacing w:after="210"/>
-      </w:pPr>
-      <w:r>
-        <w:rPr>
-          <w:rFonts w:eastAsia="Georgia" w:hAnsi="Georgia" w:cs="Georgia"/>
+        <w:rPr>
+          <w:rFonts w:asciiTheme="minorHAnsi" w:cstheme="minorHAnsi"/>
+        </w:rPr>
+      </w:pPr>
+      <w:r>
+        <w:rPr>
+          <w:rFonts w:asciiTheme="minorHAnsi" w:eastAsia="Georgia" w:cstheme="minorHAnsi"/>
         </w:rPr>
         <w:t>WITH sales_2023 AS (</w:t>
       </w:r>
       <w:r>
+        <w:rPr>
+          <w:rFonts w:asciiTheme="minorHAnsi" w:cstheme="minorHAnsi"/>
+        </w:rPr>
         <w:br/>
         <w:t>SELECT * FROM sales WHERE year = 2023</w:t>
       </w:r>
       <w:r>
+        <w:rPr>
+          <w:rFonts w:asciiTheme="minorHAnsi" w:cstheme="minorHAnsi"/>
+        </w:rPr>
         <w:br/>
         <w:t>),</w:t>
       </w:r>
       <w:r>
-        <w:br/>
-      </w:r>
-      <w:r>
-        <w:rPr>
-          <w:rFonts w:eastAsia="Georgia" w:hAnsi="Georgia" w:cs="Georgia"/>
+        <w:rPr>
+          <w:rFonts w:asciiTheme="minorHAnsi" w:cstheme="minorHAnsi"/>
+        </w:rPr>
+        <w:br/>
+      </w:r>
+      <w:r>
+        <w:rPr>
+          <w:rFonts w:asciiTheme="minorHAnsi" w:eastAsia="Georgia" w:cstheme="minorHAnsi"/>
         </w:rPr>
         <w:t>top_products AS (</w:t>
       </w:r>
       <w:r>
-        <w:br/>
-      </w:r>
-      <w:r>
-        <w:rPr>
-          <w:rFonts w:eastAsia="Georgia" w:hAnsi="Georgia" w:cs="Georgia"/>
+        <w:rPr>
+          <w:rFonts w:asciiTheme="minorHAnsi" w:cstheme="minorHAnsi"/>
+        </w:rPr>
+        <w:br/>
+      </w:r>
+      <w:r>
+        <w:rPr>
+          <w:rFonts w:asciiTheme="minorHAnsi" w:eastAsia="Georgia" w:cstheme="minorHAnsi"/>
         </w:rPr>
         <w:t>SELECT product_id, SUM(amount) as total</w:t>
       </w:r>
       <w:r>
-        <w:br/>
-      </w:r>
-      <w:r>
-        <w:rPr>
-          <w:rFonts w:eastAsia="Georgia" w:hAnsi="Georgia" w:cs="Georgia"/>
+        <w:rPr>
+          <w:rFonts w:asciiTheme="minorHAnsi" w:cstheme="minorHAnsi"/>
+        </w:rPr>
+        <w:br/>
+      </w:r>
+      <w:r>
+        <w:rPr>
+          <w:rFonts w:asciiTheme="minorHAnsi" w:eastAsia="Georgia" w:cstheme="minorHAnsi"/>
         </w:rPr>
         <w:t>FROM sales_2023</w:t>
       </w:r>
       <w:r>
-        <w:br/>
-      </w:r>
-      <w:r>
-        <w:rPr>
-          <w:rFonts w:eastAsia="Georgia" w:hAnsi="Georgia" w:cs="Georgia"/>
+        <w:rPr>
+          <w:rFonts w:asciiTheme="minorHAnsi" w:cstheme="minorHAnsi"/>
+        </w:rPr>
+        <w:br/>
+      </w:r>
+      <w:r>
+        <w:rPr>
+          <w:rFonts w:asciiTheme="minorHAnsi" w:eastAsia="Georgia" w:cstheme="minorHAnsi"/>
         </w:rPr>
         <w:t>GROUP BY product_id</w:t>
       </w:r>
       <w:r>
+        <w:rPr>
+          <w:rFonts w:asciiTheme="minorHAnsi" w:cstheme="minorHAnsi"/>
+        </w:rPr>
         <w:br/>
         <w:t>ORDER BY total DESC</w:t>
       </w:r>
       <w:r>
+        <w:rPr>
+          <w:rFonts w:asciiTheme="minorHAnsi" w:cstheme="minorHAnsi"/>
+        </w:rPr>
         <w:br/>
         <w:t>LIMIT 10</w:t>
       </w:r>
       <w:r>
+        <w:rPr>
+          <w:rFonts w:asciiTheme="minorHAnsi" w:cstheme="minorHAnsi"/>
+        </w:rPr>
         <w:br/>
         <w:t>)</w:t>
       </w:r>
       <w:r>
-        <w:br/>
-      </w:r>
-      <w:r>
-        <w:rPr>
-          <w:rFonts w:eastAsia="Georgia" w:hAnsi="Georgia" w:cs="Georgia"/>
+        <w:rPr>
+          <w:rFonts w:asciiTheme="minorHAnsi" w:cstheme="minorHAnsi"/>
+        </w:rPr>
+        <w:br/>
+      </w:r>
+      <w:r>
+        <w:rPr>
+          <w:rFonts w:asciiTheme="minorHAnsi" w:eastAsia="Georgia" w:cstheme="minorHAnsi"/>
         </w:rPr>
         <w:t>SELECT * FROM top_products;</w:t>
       </w:r>
@@ -8378,7 +8477,7 @@
       <w:pPr>
         <w:spacing w:before="240" w:line="271" w:lineRule="auto"/>
       </w:pPr>
-      <w:bookmarkStart w:id="81" w:name="recursive_ctes"/>
+      <w:bookmarkStart w:id="82" w:name="recursive_ctes"/>
       <w:r>
         <w:rPr>
           <w:b/>
@@ -8386,7 +8485,7 @@
         </w:rPr>
         <w:t>Recursive CTEs</w:t>
       </w:r>
-      <w:bookmarkEnd w:id="81"/>
+      <w:bookmarkEnd w:id="82"/>
     </w:p>
     <w:p>
       <w:pPr>
@@ -8534,7 +8633,7 @@
       <w:pPr>
         <w:spacing w:before="240" w:line="271" w:lineRule="auto"/>
       </w:pPr>
-      <w:bookmarkStart w:id="82" w:name="subquery_vs_cte_vs_join"/>
+      <w:bookmarkStart w:id="83" w:name="subquery_vs_cte_vs_join"/>
       <w:r>
         <w:rPr>
           <w:b/>
@@ -8542,7 +8641,7 @@
         </w:rPr>
         <w:t>Subquery vs CTE vs Join</w:t>
       </w:r>
-      <w:bookmarkEnd w:id="82"/>
+      <w:bookmarkEnd w:id="83"/>
     </w:p>
     <w:p>
       <w:pPr>
@@ -8917,7 +9016,7 @@
       <w:pPr>
         <w:spacing w:before="240" w:line="288" w:lineRule="auto"/>
       </w:pPr>
-      <w:bookmarkStart w:id="83" w:name="chapter_10_constraints_keys"/>
+      <w:bookmarkStart w:id="84" w:name="chapter_10_constraints_keys"/>
       <w:r>
         <w:rPr>
           <w:b/>
@@ -8925,13 +9024,13 @@
         </w:rPr>
         <w:t>Chapter 10: Constraints &amp; Keys</w:t>
       </w:r>
-      <w:bookmarkEnd w:id="83"/>
+      <w:bookmarkEnd w:id="84"/>
     </w:p>
     <w:p>
       <w:pPr>
         <w:spacing w:before="240" w:line="271" w:lineRule="auto"/>
       </w:pPr>
-      <w:bookmarkStart w:id="84" w:name="primary_key"/>
+      <w:bookmarkStart w:id="85" w:name="primary_key"/>
       <w:r>
         <w:rPr>
           <w:b/>
@@ -8939,7 +9038,7 @@
         </w:rPr>
         <w:t>PRIMARY KEY</w:t>
       </w:r>
-      <w:bookmarkEnd w:id="84"/>
+      <w:bookmarkEnd w:id="85"/>
     </w:p>
     <w:p>
       <w:pPr>
@@ -9131,7 +9230,7 @@
       <w:pPr>
         <w:spacing w:before="240" w:line="271" w:lineRule="auto"/>
       </w:pPr>
-      <w:bookmarkStart w:id="85" w:name="foreign_key"/>
+      <w:bookmarkStart w:id="86" w:name="foreign_key"/>
       <w:r>
         <w:rPr>
           <w:b/>
@@ -9139,7 +9238,7 @@
         </w:rPr>
         <w:t>FOREIGN KEY</w:t>
       </w:r>
-      <w:bookmarkEnd w:id="85"/>
+      <w:bookmarkEnd w:id="86"/>
     </w:p>
     <w:p>
       <w:pPr>
@@ -9305,7 +9404,7 @@
       <w:pPr>
         <w:spacing w:before="240" w:line="271" w:lineRule="auto"/>
       </w:pPr>
-      <w:bookmarkStart w:id="86" w:name="unique_constraint"/>
+      <w:bookmarkStart w:id="87" w:name="unique_constraint"/>
       <w:r>
         <w:rPr>
           <w:b/>
@@ -9313,7 +9412,7 @@
         </w:rPr>
         <w:t>UNIQUE Constraint</w:t>
       </w:r>
-      <w:bookmarkEnd w:id="86"/>
+      <w:bookmarkEnd w:id="87"/>
     </w:p>
     <w:p>
       <w:pPr>
@@ -9412,7 +9511,7 @@
       <w:pPr>
         <w:spacing w:before="240" w:line="271" w:lineRule="auto"/>
       </w:pPr>
-      <w:bookmarkStart w:id="87" w:name="check_constraint"/>
+      <w:bookmarkStart w:id="88" w:name="check_constraint"/>
       <w:r>
         <w:rPr>
           <w:b/>
@@ -9420,7 +9519,7 @@
         </w:rPr>
         <w:t>CHECK Constraint</w:t>
       </w:r>
-      <w:bookmarkEnd w:id="87"/>
+      <w:bookmarkEnd w:id="88"/>
     </w:p>
     <w:p>
       <w:pPr>
@@ -9482,7 +9581,7 @@
       <w:pPr>
         <w:spacing w:before="240" w:line="271" w:lineRule="auto"/>
       </w:pPr>
-      <w:bookmarkStart w:id="88" w:name="default_constraint"/>
+      <w:bookmarkStart w:id="89" w:name="default_constraint"/>
       <w:r>
         <w:rPr>
           <w:b/>
@@ -9490,7 +9589,7 @@
         </w:rPr>
         <w:t>DEFAULT Constraint</w:t>
       </w:r>
-      <w:bookmarkEnd w:id="88"/>
+      <w:bookmarkEnd w:id="89"/>
     </w:p>
     <w:p>
       <w:pPr>
@@ -9570,7 +9669,7 @@
       <w:pPr>
         <w:spacing w:before="240" w:line="271" w:lineRule="auto"/>
       </w:pPr>
-      <w:bookmarkStart w:id="89" w:name="complete_table_example_with_all_c_b729b4"/>
+      <w:bookmarkStart w:id="90" w:name="complete_table_example_with_all_c_b729b4"/>
       <w:r>
         <w:rPr>
           <w:b/>
@@ -9578,7 +9677,7 @@
         </w:rPr>
         <w:t>Complete Table Example with All Constraints</w:t>
       </w:r>
-      <w:bookmarkEnd w:id="89"/>
+      <w:bookmarkEnd w:id="90"/>
     </w:p>
     <w:p>
       <w:pPr>
@@ -9714,7 +9813,7 @@
       <w:pPr>
         <w:spacing w:before="240" w:line="288" w:lineRule="auto"/>
       </w:pPr>
-      <w:bookmarkStart w:id="90" w:name="chapter_11_indexes_performance"/>
+      <w:bookmarkStart w:id="91" w:name="chapter_11_indexes_performance"/>
       <w:r>
         <w:rPr>
           <w:b/>
@@ -9722,13 +9821,13 @@
         </w:rPr>
         <w:t>Chapter 11: Indexes &amp; Performance</w:t>
       </w:r>
-      <w:bookmarkEnd w:id="90"/>
+      <w:bookmarkEnd w:id="91"/>
     </w:p>
     <w:p>
       <w:pPr>
         <w:spacing w:before="240" w:line="271" w:lineRule="auto"/>
       </w:pPr>
-      <w:bookmarkStart w:id="91" w:name="index_basics"/>
+      <w:bookmarkStart w:id="92" w:name="index_basics"/>
       <w:r>
         <w:rPr>
           <w:b/>
@@ -9736,7 +9835,7 @@
         </w:rPr>
         <w:t>Index Basics</w:t>
       </w:r>
-      <w:bookmarkEnd w:id="91"/>
+      <w:bookmarkEnd w:id="92"/>
     </w:p>
     <w:p>
       <w:pPr>
@@ -9828,7 +9927,7 @@
       <w:pPr>
         <w:spacing w:before="240" w:line="271" w:lineRule="auto"/>
       </w:pPr>
-      <w:bookmarkStart w:id="92" w:name="types_of_indexes"/>
+      <w:bookmarkStart w:id="93" w:name="types_of_indexes"/>
       <w:r>
         <w:rPr>
           <w:b/>
@@ -9836,13 +9935,13 @@
         </w:rPr>
         <w:t>Types of Indexes</w:t>
       </w:r>
-      <w:bookmarkEnd w:id="92"/>
+      <w:bookmarkEnd w:id="93"/>
     </w:p>
     <w:p>
       <w:pPr>
         <w:spacing w:before="240" w:line="271" w:lineRule="auto"/>
       </w:pPr>
-      <w:bookmarkStart w:id="93" w:name="single_column_index"/>
+      <w:bookmarkStart w:id="94" w:name="single_column_index"/>
       <w:r>
         <w:rPr>
           <w:b/>
@@ -9850,7 +9949,7 @@
         </w:rPr>
         <w:t>Single Column Index</w:t>
       </w:r>
-      <w:bookmarkEnd w:id="93"/>
+      <w:bookmarkEnd w:id="94"/>
     </w:p>
     <w:p>
       <w:pPr>
@@ -9894,7 +9993,7 @@
       <w:pPr>
         <w:spacing w:before="240" w:line="271" w:lineRule="auto"/>
       </w:pPr>
-      <w:bookmarkStart w:id="94" w:name="composite_index_multiple_columns"/>
+      <w:bookmarkStart w:id="95" w:name="composite_index_multiple_columns"/>
       <w:r>
         <w:rPr>
           <w:b/>
@@ -9902,7 +10001,7 @@
         </w:rPr>
         <w:t>Composite Index (Multiple Columns)</w:t>
       </w:r>
-      <w:bookmarkEnd w:id="94"/>
+      <w:bookmarkEnd w:id="95"/>
     </w:p>
     <w:p>
       <w:pPr>
@@ -9937,7 +10036,7 @@
       <w:pPr>
         <w:spacing w:before="240" w:line="271" w:lineRule="auto"/>
       </w:pPr>
-      <w:bookmarkStart w:id="95" w:name="unique_index"/>
+      <w:bookmarkStart w:id="96" w:name="unique_index"/>
       <w:r>
         <w:rPr>
           <w:b/>
@@ -9945,7 +10044,7 @@
         </w:rPr>
         <w:t>Unique Index</w:t>
       </w:r>
-      <w:bookmarkEnd w:id="95"/>
+      <w:bookmarkEnd w:id="96"/>
     </w:p>
     <w:p>
       <w:pPr>
@@ -9982,7 +10081,7 @@
       <w:pPr>
         <w:spacing w:before="240" w:line="271" w:lineRule="auto"/>
       </w:pPr>
-      <w:bookmarkStart w:id="96" w:name="full_text_index_text_search"/>
+      <w:bookmarkStart w:id="97" w:name="full_text_index_text_search"/>
       <w:r>
         <w:rPr>
           <w:b/>
@@ -9990,7 +10089,7 @@
         </w:rPr>
         <w:t>Full-Text Index (Text Search)</w:t>
       </w:r>
-      <w:bookmarkEnd w:id="96"/>
+      <w:bookmarkEnd w:id="97"/>
     </w:p>
     <w:p>
       <w:pPr>
@@ -10040,7 +10139,7 @@
       <w:pPr>
         <w:spacing w:before="240" w:line="271" w:lineRule="auto"/>
       </w:pPr>
-      <w:bookmarkStart w:id="97" w:name="when_to_use_indexes"/>
+      <w:bookmarkStart w:id="98" w:name="when_to_use_indexes"/>
       <w:r>
         <w:rPr>
           <w:b/>
@@ -10048,7 +10147,7 @@
         </w:rPr>
         <w:t>When to Use Indexes</w:t>
       </w:r>
-      <w:bookmarkEnd w:id="97"/>
+      <w:bookmarkEnd w:id="98"/>
     </w:p>
     <w:p>
       <w:pPr>
@@ -10180,7 +10279,7 @@
           <w:sz w:val="42"/>
         </w:rPr>
       </w:pPr>
-      <w:bookmarkStart w:id="98" w:name="query_optimization_tips"/>
+      <w:bookmarkStart w:id="99" w:name="query_optimization_tips"/>
     </w:p>
     <w:p>
       <w:pPr>
@@ -10408,7 +10507,7 @@
           <w:lang w:val="en-IN" w:eastAsia="en-IN"/>
         </w:rPr>
         <w:pict>
-          <v:rect id="_x0000_i1070" style="width:0;height:1.5pt" o:hralign="center" o:hrstd="t" o:hr="t" fillcolor="#a0a0a0" stroked="f"/>
+          <v:rect id="_x0000_i1037" style="width:0;height:1.5pt" o:hralign="center" o:hrstd="t" o:hr="t" fillcolor="#a0a0a0" stroked="f"/>
         </w:pict>
       </w:r>
     </w:p>
@@ -10678,7 +10777,7 @@
           <w:lang w:val="en-IN" w:eastAsia="en-IN"/>
         </w:rPr>
         <w:pict>
-          <v:rect id="_x0000_i1071" style="width:0;height:1.5pt" o:hralign="center" o:hrstd="t" o:hr="t" fillcolor="#a0a0a0" stroked="f"/>
+          <v:rect id="_x0000_i1038" style="width:0;height:1.5pt" o:hralign="center" o:hrstd="t" o:hr="t" fillcolor="#a0a0a0" stroked="f"/>
         </w:pict>
       </w:r>
     </w:p>
@@ -10811,7 +10910,7 @@
           <w:lang w:val="en-IN" w:eastAsia="en-IN"/>
         </w:rPr>
         <w:pict>
-          <v:rect id="_x0000_i1072" style="width:0;height:1.5pt" o:hralign="center" o:hrstd="t" o:hr="t" fillcolor="#a0a0a0" stroked="f"/>
+          <v:rect id="_x0000_i1039" style="width:0;height:1.5pt" o:hralign="center" o:hrstd="t" o:hr="t" fillcolor="#a0a0a0" stroked="f"/>
         </w:pict>
       </w:r>
     </w:p>
@@ -10851,14 +10950,16 @@
           <w:rFonts w:ascii="Times New Roman" w:eastAsia="Times New Roman" w:hAnsi="Times New Roman" w:cs="Times New Roman"/>
           <w:sz w:val="24"/>
           <w:szCs w:val="24"/>
-          <w:lang w:val="en-IN" w:eastAsia="en-IN"/>
-        </w:rPr>
-      </w:pPr>
-      <w:r>
-        <w:rPr>
-          <w:rFonts w:ascii="Times New Roman" w:eastAsia="Times New Roman" w:hAnsi="Times New Roman" w:cs="Times New Roman"/>
-          <w:sz w:val="24"/>
-          <w:szCs w:val="24"/>
+          <w:highlight w:val="cyan"/>
+          <w:lang w:val="en-IN" w:eastAsia="en-IN"/>
+        </w:rPr>
+      </w:pPr>
+      <w:r>
+        <w:rPr>
+          <w:rFonts w:ascii="Times New Roman" w:eastAsia="Times New Roman" w:hAnsi="Times New Roman" w:cs="Times New Roman"/>
+          <w:sz w:val="24"/>
+          <w:szCs w:val="24"/>
+          <w:highlight w:val="cyan"/>
           <w:lang w:val="en-IN" w:eastAsia="en-IN"/>
         </w:rPr>
         <w:t xml:space="preserve">The database reads </w:t>
@@ -10870,6 +10971,7 @@
           <w:bCs/>
           <w:sz w:val="24"/>
           <w:szCs w:val="24"/>
+          <w:highlight w:val="cyan"/>
           <w:lang w:val="en-IN" w:eastAsia="en-IN"/>
         </w:rPr>
         <w:t>all existing rows</w:t>
@@ -10879,6 +10981,7 @@
           <w:rFonts w:ascii="Times New Roman" w:eastAsia="Times New Roman" w:hAnsi="Times New Roman" w:cs="Times New Roman"/>
           <w:sz w:val="24"/>
           <w:szCs w:val="24"/>
+          <w:highlight w:val="cyan"/>
           <w:lang w:val="en-IN" w:eastAsia="en-IN"/>
         </w:rPr>
         <w:t xml:space="preserve"> in the </w:t>
@@ -10888,6 +10991,7 @@
           <w:rFonts w:ascii="Courier New" w:eastAsia="Times New Roman" w:hAnsi="Courier New" w:cs="Courier New"/>
           <w:sz w:val="20"/>
           <w:szCs w:val="20"/>
+          <w:highlight w:val="cyan"/>
           <w:lang w:val="en-IN" w:eastAsia="en-IN"/>
         </w:rPr>
         <w:t>employees</w:t>
@@ -10897,6 +11001,7 @@
           <w:rFonts w:ascii="Times New Roman" w:eastAsia="Times New Roman" w:hAnsi="Times New Roman" w:cs="Times New Roman"/>
           <w:sz w:val="24"/>
           <w:szCs w:val="24"/>
+          <w:highlight w:val="cyan"/>
           <w:lang w:val="en-IN" w:eastAsia="en-IN"/>
         </w:rPr>
         <w:t xml:space="preserve"> table.</w:t>
@@ -10913,14 +11018,16 @@
           <w:rFonts w:ascii="Times New Roman" w:eastAsia="Times New Roman" w:hAnsi="Times New Roman" w:cs="Times New Roman"/>
           <w:sz w:val="24"/>
           <w:szCs w:val="24"/>
-          <w:lang w:val="en-IN" w:eastAsia="en-IN"/>
-        </w:rPr>
-      </w:pPr>
-      <w:r>
-        <w:rPr>
-          <w:rFonts w:ascii="Times New Roman" w:eastAsia="Times New Roman" w:hAnsi="Times New Roman" w:cs="Times New Roman"/>
-          <w:sz w:val="24"/>
-          <w:szCs w:val="24"/>
+          <w:highlight w:val="cyan"/>
+          <w:lang w:val="en-IN" w:eastAsia="en-IN"/>
+        </w:rPr>
+      </w:pPr>
+      <w:r>
+        <w:rPr>
+          <w:rFonts w:ascii="Times New Roman" w:eastAsia="Times New Roman" w:hAnsi="Times New Roman" w:cs="Times New Roman"/>
+          <w:sz w:val="24"/>
+          <w:szCs w:val="24"/>
+          <w:highlight w:val="cyan"/>
           <w:lang w:val="en-IN" w:eastAsia="en-IN"/>
         </w:rPr>
         <w:t>For each row, it extracts:</w:t>
@@ -10937,14 +11044,16 @@
           <w:rFonts w:ascii="Times New Roman" w:eastAsia="Times New Roman" w:hAnsi="Times New Roman" w:cs="Times New Roman"/>
           <w:sz w:val="24"/>
           <w:szCs w:val="24"/>
-          <w:lang w:val="en-IN" w:eastAsia="en-IN"/>
-        </w:rPr>
-      </w:pPr>
-      <w:r>
-        <w:rPr>
-          <w:rFonts w:ascii="Times New Roman" w:eastAsia="Times New Roman" w:hAnsi="Times New Roman" w:cs="Times New Roman"/>
-          <w:sz w:val="24"/>
-          <w:szCs w:val="24"/>
+          <w:highlight w:val="cyan"/>
+          <w:lang w:val="en-IN" w:eastAsia="en-IN"/>
+        </w:rPr>
+      </w:pPr>
+      <w:r>
+        <w:rPr>
+          <w:rFonts w:ascii="Times New Roman" w:eastAsia="Times New Roman" w:hAnsi="Times New Roman" w:cs="Times New Roman"/>
+          <w:sz w:val="24"/>
+          <w:szCs w:val="24"/>
+          <w:highlight w:val="cyan"/>
           <w:lang w:val="en-IN" w:eastAsia="en-IN"/>
         </w:rPr>
         <w:t xml:space="preserve">The value of </w:t>
@@ -10954,6 +11063,7 @@
           <w:rFonts w:ascii="Courier New" w:eastAsia="Times New Roman" w:hAnsi="Courier New" w:cs="Courier New"/>
           <w:sz w:val="20"/>
           <w:szCs w:val="20"/>
+          <w:highlight w:val="cyan"/>
           <w:lang w:val="en-IN" w:eastAsia="en-IN"/>
         </w:rPr>
         <w:t>salary</w:t>
@@ -10970,14 +11080,16 @@
           <w:rFonts w:ascii="Times New Roman" w:eastAsia="Times New Roman" w:hAnsi="Times New Roman" w:cs="Times New Roman"/>
           <w:sz w:val="24"/>
           <w:szCs w:val="24"/>
-          <w:lang w:val="en-IN" w:eastAsia="en-IN"/>
-        </w:rPr>
-      </w:pPr>
-      <w:r>
-        <w:rPr>
-          <w:rFonts w:ascii="Times New Roman" w:eastAsia="Times New Roman" w:hAnsi="Times New Roman" w:cs="Times New Roman"/>
-          <w:sz w:val="24"/>
-          <w:szCs w:val="24"/>
+          <w:highlight w:val="cyan"/>
+          <w:lang w:val="en-IN" w:eastAsia="en-IN"/>
+        </w:rPr>
+      </w:pPr>
+      <w:r>
+        <w:rPr>
+          <w:rFonts w:ascii="Times New Roman" w:eastAsia="Times New Roman" w:hAnsi="Times New Roman" w:cs="Times New Roman"/>
+          <w:sz w:val="24"/>
+          <w:szCs w:val="24"/>
+          <w:highlight w:val="cyan"/>
           <w:lang w:val="en-IN" w:eastAsia="en-IN"/>
         </w:rPr>
         <w:t>The physical location of that row in storage (row pointer)</w:t>
@@ -11001,7 +11113,7 @@
           <w:lang w:val="en-IN" w:eastAsia="en-IN"/>
         </w:rPr>
         <w:pict>
-          <v:rect id="_x0000_i1073" style="width:0;height:1.5pt" o:hralign="center" o:hrstd="t" o:hr="t" fillcolor="#a0a0a0" stroked="f"/>
+          <v:rect id="_x0000_i1040" style="width:0;height:1.5pt" o:hralign="center" o:hrstd="t" o:hr="t" fillcolor="#a0a0a0" stroked="f"/>
         </w:pict>
       </w:r>
     </w:p>
@@ -11347,14 +11459,16 @@
           <w:rFonts w:ascii="Times New Roman" w:eastAsia="Times New Roman" w:hAnsi="Times New Roman" w:cs="Times New Roman"/>
           <w:sz w:val="24"/>
           <w:szCs w:val="24"/>
-          <w:lang w:val="en-IN" w:eastAsia="en-IN"/>
-        </w:rPr>
-      </w:pPr>
-      <w:r>
-        <w:rPr>
-          <w:rFonts w:ascii="Times New Roman" w:eastAsia="Times New Roman" w:hAnsi="Times New Roman" w:cs="Times New Roman"/>
-          <w:sz w:val="24"/>
-          <w:szCs w:val="24"/>
+          <w:highlight w:val="cyan"/>
+          <w:lang w:val="en-IN" w:eastAsia="en-IN"/>
+        </w:rPr>
+      </w:pPr>
+      <w:r>
+        <w:rPr>
+          <w:rFonts w:ascii="Times New Roman" w:eastAsia="Times New Roman" w:hAnsi="Times New Roman" w:cs="Times New Roman"/>
+          <w:sz w:val="24"/>
+          <w:szCs w:val="24"/>
+          <w:highlight w:val="cyan"/>
           <w:lang w:val="en-IN" w:eastAsia="en-IN"/>
         </w:rPr>
         <w:t xml:space="preserve">This index is stored </w:t>
@@ -11366,6 +11480,7 @@
           <w:bCs/>
           <w:sz w:val="24"/>
           <w:szCs w:val="24"/>
+          <w:highlight w:val="cyan"/>
           <w:lang w:val="en-IN" w:eastAsia="en-IN"/>
         </w:rPr>
         <w:t>separately</w:t>
@@ -11375,6 +11490,7 @@
           <w:rFonts w:ascii="Times New Roman" w:eastAsia="Times New Roman" w:hAnsi="Times New Roman" w:cs="Times New Roman"/>
           <w:sz w:val="24"/>
           <w:szCs w:val="24"/>
+          <w:highlight w:val="cyan"/>
           <w:lang w:val="en-IN" w:eastAsia="en-IN"/>
         </w:rPr>
         <w:t xml:space="preserve"> from the table</w:t>
@@ -11391,14 +11507,16 @@
           <w:rFonts w:ascii="Times New Roman" w:eastAsia="Times New Roman" w:hAnsi="Times New Roman" w:cs="Times New Roman"/>
           <w:sz w:val="24"/>
           <w:szCs w:val="24"/>
-          <w:lang w:val="en-IN" w:eastAsia="en-IN"/>
-        </w:rPr>
-      </w:pPr>
-      <w:r>
-        <w:rPr>
-          <w:rFonts w:ascii="Times New Roman" w:eastAsia="Times New Roman" w:hAnsi="Times New Roman" w:cs="Times New Roman"/>
-          <w:sz w:val="24"/>
-          <w:szCs w:val="24"/>
+          <w:highlight w:val="cyan"/>
+          <w:lang w:val="en-IN" w:eastAsia="en-IN"/>
+        </w:rPr>
+      </w:pPr>
+      <w:r>
+        <w:rPr>
+          <w:rFonts w:ascii="Times New Roman" w:eastAsia="Times New Roman" w:hAnsi="Times New Roman" w:cs="Times New Roman"/>
+          <w:sz w:val="24"/>
+          <w:szCs w:val="24"/>
+          <w:highlight w:val="cyan"/>
           <w:lang w:val="en-IN" w:eastAsia="en-IN"/>
         </w:rPr>
         <w:lastRenderedPageBreak/>
@@ -11411,6 +11529,7 @@
           <w:bCs/>
           <w:sz w:val="24"/>
           <w:szCs w:val="24"/>
+          <w:highlight w:val="cyan"/>
           <w:lang w:val="en-IN" w:eastAsia="en-IN"/>
         </w:rPr>
         <w:t>sorted by salary</w:t>
@@ -11434,7 +11553,7 @@
           <w:lang w:val="en-IN" w:eastAsia="en-IN"/>
         </w:rPr>
         <w:pict>
-          <v:rect id="_x0000_i1074" style="width:0;height:1.5pt" o:hralign="center" o:hrstd="t" o:hr="t" fillcolor="#a0a0a0" stroked="f"/>
+          <v:rect id="_x0000_i1041" style="width:0;height:1.5pt" o:hralign="center" o:hrstd="t" o:hr="t" fillcolor="#a0a0a0" stroked="f"/>
         </w:pict>
       </w:r>
     </w:p>
@@ -11599,7 +11718,7 @@
           <w:lang w:val="en-IN" w:eastAsia="en-IN"/>
         </w:rPr>
         <w:pict>
-          <v:rect id="_x0000_i1075" style="width:0;height:1.5pt" o:hralign="center" o:hrstd="t" o:hr="t" fillcolor="#a0a0a0" stroked="f"/>
+          <v:rect id="_x0000_i1042" style="width:0;height:1.5pt" o:hralign="center" o:hrstd="t" o:hr="t" fillcolor="#a0a0a0" stroked="f"/>
         </w:pict>
       </w:r>
     </w:p>
@@ -11670,7 +11789,7 @@
         </w:tabs>
         <w:spacing w:after="0" w:line="240" w:lineRule="auto"/>
         <w:rPr>
-          <w:rFonts w:ascii="Courier New" w:eastAsia="Times New Roman" w:hAnsi="Courier New" w:cs="Courier New"/>
+          <w:rFonts w:asciiTheme="minorHAnsi" w:eastAsia="Times New Roman" w:cstheme="minorHAnsi"/>
           <w:sz w:val="20"/>
           <w:szCs w:val="20"/>
           <w:lang w:val="en-IN" w:eastAsia="en-IN"/>
@@ -11678,7 +11797,7 @@
       </w:pPr>
       <w:r>
         <w:rPr>
-          <w:rFonts w:ascii="Courier New" w:eastAsia="Times New Roman" w:hAnsi="Courier New" w:cs="Courier New"/>
+          <w:rFonts w:asciiTheme="minorHAnsi" w:eastAsia="Times New Roman" w:cstheme="minorHAnsi"/>
           <w:sz w:val="20"/>
           <w:szCs w:val="20"/>
           <w:lang w:val="en-IN" w:eastAsia="en-IN"/>
@@ -11824,31 +11943,29 @@
           <w:szCs w:val="24"/>
           <w:lang w:val="en-IN" w:eastAsia="en-IN"/>
         </w:rPr>
-        <w:t xml:space="preserve">Time complexity: </w:t>
-      </w:r>
-      <w:proofErr w:type="gramStart"/>
+        <w:t>Time complexity</w:t>
+      </w:r>
+      <w:r>
+        <w:rPr>
+          <w:rFonts w:ascii="Times New Roman" w:eastAsia="Times New Roman" w:hAnsi="Times New Roman" w:cs="Times New Roman"/>
+          <w:noProof/>
+          <w:sz w:val="24"/>
+          <w:szCs w:val="24"/>
+          <w:lang w:val="en-IN" w:eastAsia="en-IN"/>
+        </w:rPr>
+        <w:t xml:space="preserve">: </w:t>
+      </w:r>
       <w:r>
         <w:rPr>
           <w:rFonts w:ascii="Times New Roman" w:eastAsia="Times New Roman" w:hAnsi="Times New Roman" w:cs="Times New Roman"/>
           <w:b/>
           <w:bCs/>
-          <w:sz w:val="24"/>
-          <w:szCs w:val="24"/>
-          <w:lang w:val="en-IN" w:eastAsia="en-IN"/>
-        </w:rPr>
-        <w:t>O(</w:t>
-      </w:r>
-      <w:proofErr w:type="gramEnd"/>
-      <w:r>
-        <w:rPr>
-          <w:rFonts w:ascii="Times New Roman" w:eastAsia="Times New Roman" w:hAnsi="Times New Roman" w:cs="Times New Roman"/>
-          <w:b/>
-          <w:bCs/>
-          <w:sz w:val="24"/>
-          <w:szCs w:val="24"/>
-          <w:lang w:val="en-IN" w:eastAsia="en-IN"/>
-        </w:rPr>
-        <w:t>n)</w:t>
+          <w:noProof/>
+          <w:sz w:val="24"/>
+          <w:szCs w:val="24"/>
+          <w:lang w:val="en-IN" w:eastAsia="en-IN"/>
+        </w:rPr>
+        <w:t>O(n)</w:t>
       </w:r>
     </w:p>
     <w:p>
@@ -11869,7 +11986,7 @@
           <w:lang w:val="en-IN" w:eastAsia="en-IN"/>
         </w:rPr>
         <w:pict>
-          <v:rect id="_x0000_i1076" style="width:0;height:1.5pt" o:hralign="center" o:hrstd="t" o:hr="t" fillcolor="#a0a0a0" stroked="f"/>
+          <v:rect id="_x0000_i1043" style="width:0;height:1.5pt" o:hralign="center" o:hrstd="t" o:hr="t" fillcolor="#a0a0a0" stroked="f"/>
         </w:pict>
       </w:r>
     </w:p>
@@ -11907,34 +12024,26 @@
         <w:spacing w:before="100" w:beforeAutospacing="1" w:after="100" w:afterAutospacing="1" w:line="240" w:lineRule="auto"/>
         <w:rPr>
           <w:rFonts w:ascii="Times New Roman" w:eastAsia="Times New Roman" w:hAnsi="Times New Roman" w:cs="Times New Roman"/>
-          <w:sz w:val="24"/>
-          <w:szCs w:val="24"/>
-          <w:lang w:val="en-IN" w:eastAsia="en-IN"/>
-        </w:rPr>
-      </w:pPr>
-      <w:proofErr w:type="spellStart"/>
-      <w:r>
-        <w:rPr>
-          <w:rFonts w:ascii="Times New Roman" w:eastAsia="Times New Roman" w:hAnsi="Times New Roman" w:cs="Times New Roman"/>
-          <w:sz w:val="24"/>
-          <w:szCs w:val="24"/>
-          <w:lang w:val="en-IN" w:eastAsia="en-IN"/>
-        </w:rPr>
-        <w:t>PostgreSQL</w:t>
-      </w:r>
-      <w:proofErr w:type="spellEnd"/>
-      <w:r>
-        <w:rPr>
-          <w:rFonts w:ascii="Times New Roman" w:eastAsia="Times New Roman" w:hAnsi="Times New Roman" w:cs="Times New Roman"/>
-          <w:sz w:val="24"/>
-          <w:szCs w:val="24"/>
-          <w:lang w:val="en-IN" w:eastAsia="en-IN"/>
-        </w:rPr>
-        <w:t xml:space="preserve"> checks if an index exists on </w:t>
+          <w:noProof/>
+          <w:sz w:val="24"/>
+          <w:szCs w:val="24"/>
+          <w:lang w:val="en-IN" w:eastAsia="en-IN"/>
+        </w:rPr>
+      </w:pPr>
+      <w:r>
+        <w:rPr>
+          <w:rFonts w:ascii="Times New Roman" w:eastAsia="Times New Roman" w:hAnsi="Times New Roman" w:cs="Times New Roman"/>
+          <w:noProof/>
+          <w:sz w:val="24"/>
+          <w:szCs w:val="24"/>
+          <w:lang w:val="en-IN" w:eastAsia="en-IN"/>
+        </w:rPr>
+        <w:t xml:space="preserve">PostgreSQL checks if an index exists on </w:t>
       </w:r>
       <w:r>
         <w:rPr>
           <w:rFonts w:ascii="Courier New" w:eastAsia="Times New Roman" w:hAnsi="Courier New" w:cs="Courier New"/>
+          <w:noProof/>
           <w:sz w:val="20"/>
           <w:szCs w:val="20"/>
           <w:lang w:val="en-IN" w:eastAsia="en-IN"/>
@@ -11951,14 +12060,16 @@
         <w:spacing w:before="100" w:beforeAutospacing="1" w:after="100" w:afterAutospacing="1" w:line="240" w:lineRule="auto"/>
         <w:rPr>
           <w:rFonts w:ascii="Times New Roman" w:eastAsia="Times New Roman" w:hAnsi="Times New Roman" w:cs="Times New Roman"/>
-          <w:sz w:val="24"/>
-          <w:szCs w:val="24"/>
-          <w:lang w:val="en-IN" w:eastAsia="en-IN"/>
-        </w:rPr>
-      </w:pPr>
-      <w:r>
-        <w:rPr>
-          <w:rFonts w:ascii="Times New Roman" w:eastAsia="Times New Roman" w:hAnsi="Times New Roman" w:cs="Times New Roman"/>
+          <w:noProof/>
+          <w:sz w:val="24"/>
+          <w:szCs w:val="24"/>
+          <w:lang w:val="en-IN" w:eastAsia="en-IN"/>
+        </w:rPr>
+      </w:pPr>
+      <w:r>
+        <w:rPr>
+          <w:rFonts w:ascii="Times New Roman" w:eastAsia="Times New Roman" w:hAnsi="Times New Roman" w:cs="Times New Roman"/>
+          <w:noProof/>
           <w:sz w:val="24"/>
           <w:szCs w:val="24"/>
           <w:lang w:val="en-IN" w:eastAsia="en-IN"/>
@@ -11975,14 +12086,16 @@
         <w:spacing w:before="100" w:beforeAutospacing="1" w:after="100" w:afterAutospacing="1" w:line="240" w:lineRule="auto"/>
         <w:rPr>
           <w:rFonts w:ascii="Times New Roman" w:eastAsia="Times New Roman" w:hAnsi="Times New Roman" w:cs="Times New Roman"/>
-          <w:sz w:val="24"/>
-          <w:szCs w:val="24"/>
-          <w:lang w:val="en-IN" w:eastAsia="en-IN"/>
-        </w:rPr>
-      </w:pPr>
-      <w:r>
-        <w:rPr>
-          <w:rFonts w:ascii="Times New Roman" w:eastAsia="Times New Roman" w:hAnsi="Times New Roman" w:cs="Times New Roman"/>
+          <w:noProof/>
+          <w:sz w:val="24"/>
+          <w:szCs w:val="24"/>
+          <w:lang w:val="en-IN" w:eastAsia="en-IN"/>
+        </w:rPr>
+      </w:pPr>
+      <w:r>
+        <w:rPr>
+          <w:rFonts w:ascii="Times New Roman" w:eastAsia="Times New Roman" w:hAnsi="Times New Roman" w:cs="Times New Roman"/>
+          <w:noProof/>
           <w:sz w:val="24"/>
           <w:szCs w:val="24"/>
           <w:lang w:val="en-IN" w:eastAsia="en-IN"/>
@@ -11994,6 +12107,7 @@
           <w:rFonts w:ascii="Times New Roman" w:eastAsia="Times New Roman" w:hAnsi="Times New Roman" w:cs="Times New Roman"/>
           <w:b/>
           <w:bCs/>
+          <w:noProof/>
           <w:sz w:val="24"/>
           <w:szCs w:val="24"/>
           <w:lang w:val="en-IN" w:eastAsia="en-IN"/>
@@ -12010,14 +12124,16 @@
         <w:spacing w:before="100" w:beforeAutospacing="1" w:after="100" w:afterAutospacing="1" w:line="240" w:lineRule="auto"/>
         <w:rPr>
           <w:rFonts w:ascii="Times New Roman" w:eastAsia="Times New Roman" w:hAnsi="Times New Roman" w:cs="Times New Roman"/>
-          <w:sz w:val="24"/>
-          <w:szCs w:val="24"/>
-          <w:lang w:val="en-IN" w:eastAsia="en-IN"/>
-        </w:rPr>
-      </w:pPr>
-      <w:r>
-        <w:rPr>
-          <w:rFonts w:ascii="Times New Roman" w:eastAsia="Times New Roman" w:hAnsi="Times New Roman" w:cs="Times New Roman"/>
+          <w:noProof/>
+          <w:sz w:val="24"/>
+          <w:szCs w:val="24"/>
+          <w:lang w:val="en-IN" w:eastAsia="en-IN"/>
+        </w:rPr>
+      </w:pPr>
+      <w:r>
+        <w:rPr>
+          <w:rFonts w:ascii="Times New Roman" w:eastAsia="Times New Roman" w:hAnsi="Times New Roman" w:cs="Times New Roman"/>
+          <w:noProof/>
           <w:sz w:val="24"/>
           <w:szCs w:val="24"/>
           <w:lang w:val="en-IN" w:eastAsia="en-IN"/>
@@ -12027,6 +12143,7 @@
       <w:r>
         <w:rPr>
           <w:rFonts w:ascii="Courier New" w:eastAsia="Times New Roman" w:hAnsi="Courier New" w:cs="Courier New"/>
+          <w:noProof/>
           <w:sz w:val="20"/>
           <w:szCs w:val="20"/>
           <w:lang w:val="en-IN" w:eastAsia="en-IN"/>
@@ -12036,6 +12153,7 @@
       <w:r>
         <w:rPr>
           <w:rFonts w:ascii="Times New Roman" w:eastAsia="Times New Roman" w:hAnsi="Times New Roman" w:cs="Times New Roman"/>
+          <w:noProof/>
           <w:sz w:val="24"/>
           <w:szCs w:val="24"/>
           <w:lang w:val="en-IN" w:eastAsia="en-IN"/>
@@ -12052,14 +12170,16 @@
         <w:spacing w:before="100" w:beforeAutospacing="1" w:after="100" w:afterAutospacing="1" w:line="240" w:lineRule="auto"/>
         <w:rPr>
           <w:rFonts w:ascii="Times New Roman" w:eastAsia="Times New Roman" w:hAnsi="Times New Roman" w:cs="Times New Roman"/>
-          <w:sz w:val="24"/>
-          <w:szCs w:val="24"/>
-          <w:lang w:val="en-IN" w:eastAsia="en-IN"/>
-        </w:rPr>
-      </w:pPr>
-      <w:r>
-        <w:rPr>
-          <w:rFonts w:ascii="Times New Roman" w:eastAsia="Times New Roman" w:hAnsi="Times New Roman" w:cs="Times New Roman"/>
+          <w:noProof/>
+          <w:sz w:val="24"/>
+          <w:szCs w:val="24"/>
+          <w:lang w:val="en-IN" w:eastAsia="en-IN"/>
+        </w:rPr>
+      </w:pPr>
+      <w:r>
+        <w:rPr>
+          <w:rFonts w:ascii="Times New Roman" w:eastAsia="Times New Roman" w:hAnsi="Times New Roman" w:cs="Times New Roman"/>
+          <w:noProof/>
           <w:sz w:val="24"/>
           <w:szCs w:val="24"/>
           <w:lang w:val="en-IN" w:eastAsia="en-IN"/>
@@ -12076,14 +12196,16 @@
         <w:spacing w:before="100" w:beforeAutospacing="1" w:after="100" w:afterAutospacing="1" w:line="240" w:lineRule="auto"/>
         <w:rPr>
           <w:rFonts w:ascii="Times New Roman" w:eastAsia="Times New Roman" w:hAnsi="Times New Roman" w:cs="Times New Roman"/>
-          <w:sz w:val="24"/>
-          <w:szCs w:val="24"/>
-          <w:lang w:val="en-IN" w:eastAsia="en-IN"/>
-        </w:rPr>
-      </w:pPr>
-      <w:r>
-        <w:rPr>
-          <w:rFonts w:ascii="Times New Roman" w:eastAsia="Times New Roman" w:hAnsi="Times New Roman" w:cs="Times New Roman"/>
+          <w:noProof/>
+          <w:sz w:val="24"/>
+          <w:szCs w:val="24"/>
+          <w:lang w:val="en-IN" w:eastAsia="en-IN"/>
+        </w:rPr>
+      </w:pPr>
+      <w:r>
+        <w:rPr>
+          <w:rFonts w:ascii="Times New Roman" w:eastAsia="Times New Roman" w:hAnsi="Times New Roman" w:cs="Times New Roman"/>
+          <w:noProof/>
           <w:sz w:val="24"/>
           <w:szCs w:val="24"/>
           <w:lang w:val="en-IN" w:eastAsia="en-IN"/>
@@ -12096,43 +12218,33 @@
         <w:spacing w:before="100" w:beforeAutospacing="1" w:after="100" w:afterAutospacing="1" w:line="240" w:lineRule="auto"/>
         <w:rPr>
           <w:rFonts w:ascii="Times New Roman" w:eastAsia="Times New Roman" w:hAnsi="Times New Roman" w:cs="Times New Roman"/>
-          <w:sz w:val="24"/>
-          <w:szCs w:val="24"/>
-          <w:lang w:val="en-IN" w:eastAsia="en-IN"/>
-        </w:rPr>
-      </w:pPr>
-      <w:r>
-        <w:rPr>
-          <w:rFonts w:ascii="Times New Roman" w:eastAsia="Times New Roman" w:hAnsi="Times New Roman" w:cs="Times New Roman"/>
+          <w:noProof/>
+          <w:sz w:val="24"/>
+          <w:szCs w:val="24"/>
+          <w:lang w:val="en-IN" w:eastAsia="en-IN"/>
+        </w:rPr>
+      </w:pPr>
+      <w:r>
+        <w:rPr>
+          <w:rFonts w:ascii="Times New Roman" w:eastAsia="Times New Roman" w:hAnsi="Times New Roman" w:cs="Times New Roman"/>
+          <w:noProof/>
           <w:sz w:val="24"/>
           <w:szCs w:val="24"/>
           <w:lang w:val="en-IN" w:eastAsia="en-IN"/>
         </w:rPr>
         <w:t xml:space="preserve">Time complexity: </w:t>
       </w:r>
-      <w:proofErr w:type="gramStart"/>
       <w:r>
         <w:rPr>
           <w:rFonts w:ascii="Times New Roman" w:eastAsia="Times New Roman" w:hAnsi="Times New Roman" w:cs="Times New Roman"/>
           <w:b/>
           <w:bCs/>
-          <w:sz w:val="24"/>
-          <w:szCs w:val="24"/>
-          <w:lang w:val="en-IN" w:eastAsia="en-IN"/>
-        </w:rPr>
-        <w:t>O(</w:t>
-      </w:r>
-      <w:proofErr w:type="gramEnd"/>
-      <w:r>
-        <w:rPr>
-          <w:rFonts w:ascii="Times New Roman" w:eastAsia="Times New Roman" w:hAnsi="Times New Roman" w:cs="Times New Roman"/>
-          <w:b/>
-          <w:bCs/>
-          <w:sz w:val="24"/>
-          <w:szCs w:val="24"/>
-          <w:lang w:val="en-IN" w:eastAsia="en-IN"/>
-        </w:rPr>
-        <w:t>log n)</w:t>
+          <w:noProof/>
+          <w:sz w:val="24"/>
+          <w:szCs w:val="24"/>
+          <w:lang w:val="en-IN" w:eastAsia="en-IN"/>
+        </w:rPr>
+        <w:t>O(log n)</w:t>
       </w:r>
     </w:p>
     <w:p>
@@ -12153,7 +12265,7 @@
           <w:lang w:val="en-IN" w:eastAsia="en-IN"/>
         </w:rPr>
         <w:pict>
-          <v:rect id="_x0000_i1077" style="width:0;height:1.5pt" o:hralign="center" o:hrstd="t" o:hr="t" fillcolor="#a0a0a0" stroked="f"/>
+          <v:rect id="_x0000_i1044" style="width:0;height:1.5pt" o:hralign="center" o:hrstd="t" o:hr="t" fillcolor="#a0a0a0" stroked="f"/>
         </w:pict>
       </w:r>
     </w:p>
@@ -12200,19 +12312,18 @@
           <w:szCs w:val="24"/>
           <w:lang w:val="en-IN" w:eastAsia="en-IN"/>
         </w:rPr>
-        <w:t xml:space="preserve">Instead of scanning rows linearly, </w:t>
-      </w:r>
-      <w:proofErr w:type="spellStart"/>
-      <w:r>
-        <w:rPr>
-          <w:rFonts w:ascii="Times New Roman" w:eastAsia="Times New Roman" w:hAnsi="Times New Roman" w:cs="Times New Roman"/>
-          <w:sz w:val="24"/>
-          <w:szCs w:val="24"/>
-          <w:lang w:val="en-IN" w:eastAsia="en-IN"/>
-        </w:rPr>
-        <w:t>PostgreSQL</w:t>
-      </w:r>
-      <w:proofErr w:type="spellEnd"/>
+        <w:t xml:space="preserve">Instead of scanning rows </w:t>
+      </w:r>
+      <w:r>
+        <w:rPr>
+          <w:rFonts w:ascii="Times New Roman" w:eastAsia="Times New Roman" w:hAnsi="Times New Roman" w:cs="Times New Roman"/>
+          <w:noProof/>
+          <w:sz w:val="24"/>
+          <w:szCs w:val="24"/>
+          <w:lang w:val="en-IN" w:eastAsia="en-IN"/>
+        </w:rPr>
+        <w:t>linearly, PostgreSQL</w:t>
+      </w:r>
       <w:r>
         <w:rPr>
           <w:rFonts w:ascii="Times New Roman" w:eastAsia="Times New Roman" w:hAnsi="Times New Roman" w:cs="Times New Roman"/>
@@ -12234,14 +12345,16 @@
           <w:rFonts w:ascii="Times New Roman" w:eastAsia="Times New Roman" w:hAnsi="Times New Roman" w:cs="Times New Roman"/>
           <w:sz w:val="24"/>
           <w:szCs w:val="24"/>
-          <w:lang w:val="en-IN" w:eastAsia="en-IN"/>
-        </w:rPr>
-      </w:pPr>
-      <w:r>
-        <w:rPr>
-          <w:rFonts w:ascii="Times New Roman" w:eastAsia="Times New Roman" w:hAnsi="Times New Roman" w:cs="Times New Roman"/>
-          <w:sz w:val="24"/>
-          <w:szCs w:val="24"/>
+          <w:highlight w:val="cyan"/>
+          <w:lang w:val="en-IN" w:eastAsia="en-IN"/>
+        </w:rPr>
+      </w:pPr>
+      <w:r>
+        <w:rPr>
+          <w:rFonts w:ascii="Times New Roman" w:eastAsia="Times New Roman" w:hAnsi="Times New Roman" w:cs="Times New Roman"/>
+          <w:sz w:val="24"/>
+          <w:szCs w:val="24"/>
+          <w:highlight w:val="cyan"/>
           <w:lang w:val="en-IN" w:eastAsia="en-IN"/>
         </w:rPr>
         <w:t>Root node decides direction</w:t>
@@ -12258,14 +12371,16 @@
           <w:rFonts w:ascii="Times New Roman" w:eastAsia="Times New Roman" w:hAnsi="Times New Roman" w:cs="Times New Roman"/>
           <w:sz w:val="24"/>
           <w:szCs w:val="24"/>
-          <w:lang w:val="en-IN" w:eastAsia="en-IN"/>
-        </w:rPr>
-      </w:pPr>
-      <w:r>
-        <w:rPr>
-          <w:rFonts w:ascii="Times New Roman" w:eastAsia="Times New Roman" w:hAnsi="Times New Roman" w:cs="Times New Roman"/>
-          <w:sz w:val="24"/>
-          <w:szCs w:val="24"/>
+          <w:highlight w:val="cyan"/>
+          <w:lang w:val="en-IN" w:eastAsia="en-IN"/>
+        </w:rPr>
+      </w:pPr>
+      <w:r>
+        <w:rPr>
+          <w:rFonts w:ascii="Times New Roman" w:eastAsia="Times New Roman" w:hAnsi="Times New Roman" w:cs="Times New Roman"/>
+          <w:sz w:val="24"/>
+          <w:szCs w:val="24"/>
+          <w:highlight w:val="cyan"/>
           <w:lang w:val="en-IN" w:eastAsia="en-IN"/>
         </w:rPr>
         <w:t>Internal nodes narrow the range</w:t>
@@ -12282,14 +12397,16 @@
           <w:rFonts w:ascii="Times New Roman" w:eastAsia="Times New Roman" w:hAnsi="Times New Roman" w:cs="Times New Roman"/>
           <w:sz w:val="24"/>
           <w:szCs w:val="24"/>
-          <w:lang w:val="en-IN" w:eastAsia="en-IN"/>
-        </w:rPr>
-      </w:pPr>
-      <w:r>
-        <w:rPr>
-          <w:rFonts w:ascii="Times New Roman" w:eastAsia="Times New Roman" w:hAnsi="Times New Roman" w:cs="Times New Roman"/>
-          <w:sz w:val="24"/>
-          <w:szCs w:val="24"/>
+          <w:highlight w:val="cyan"/>
+          <w:lang w:val="en-IN" w:eastAsia="en-IN"/>
+        </w:rPr>
+      </w:pPr>
+      <w:r>
+        <w:rPr>
+          <w:rFonts w:ascii="Times New Roman" w:eastAsia="Times New Roman" w:hAnsi="Times New Roman" w:cs="Times New Roman"/>
+          <w:sz w:val="24"/>
+          <w:szCs w:val="24"/>
+          <w:highlight w:val="cyan"/>
           <w:lang w:val="en-IN" w:eastAsia="en-IN"/>
         </w:rPr>
         <w:t>Leaf nodes contain exact salary values + row pointers</w:t>
@@ -12333,7 +12450,7 @@
           <w:lang w:val="en-IN" w:eastAsia="en-IN"/>
         </w:rPr>
         <w:pict>
-          <v:rect id="_x0000_i1078" style="width:0;height:1.5pt" o:hralign="center" o:hrstd="t" o:hr="t" fillcolor="#a0a0a0" stroked="f"/>
+          <v:rect id="_x0000_i1045" style="width:0;height:1.5pt" o:hralign="center" o:hrstd="t" o:hr="t" fillcolor="#a0a0a0" stroked="f"/>
         </w:pict>
       </w:r>
     </w:p>
@@ -12635,7 +12752,7 @@
           <w:lang w:val="en-IN" w:eastAsia="en-IN"/>
         </w:rPr>
         <w:pict>
-          <v:rect id="_x0000_i1079" style="width:0;height:1.5pt" o:hralign="center" o:hrstd="t" o:hr="t" fillcolor="#a0a0a0" stroked="f"/>
+          <v:rect id="_x0000_i1046" style="width:0;height:1.5pt" o:hralign="center" o:hrstd="t" o:hr="t" fillcolor="#a0a0a0" stroked="f"/>
         </w:pict>
       </w:r>
     </w:p>
@@ -12853,7 +12970,7 @@
           <w:lang w:val="en-IN" w:eastAsia="en-IN"/>
         </w:rPr>
         <w:pict>
-          <v:rect id="_x0000_i1080" style="width:0;height:1.5pt" o:hralign="center" o:hrstd="t" o:hr="t" fillcolor="#a0a0a0" stroked="f"/>
+          <v:rect id="_x0000_i1047" style="width:0;height:1.5pt" o:hralign="center" o:hrstd="t" o:hr="t" fillcolor="#a0a0a0" stroked="f"/>
         </w:pict>
       </w:r>
     </w:p>
@@ -13032,7 +13149,7 @@
           <w:lang w:val="en-IN" w:eastAsia="en-IN"/>
         </w:rPr>
         <w:pict>
-          <v:rect id="_x0000_i1081" style="width:0;height:1.5pt" o:hralign="center" o:hrstd="t" o:hr="t" fillcolor="#a0a0a0" stroked="f"/>
+          <v:rect id="_x0000_i1048" style="width:0;height:1.5pt" o:hralign="center" o:hrstd="t" o:hr="t" fillcolor="#a0a0a0" stroked="f"/>
         </w:pict>
       </w:r>
     </w:p>
@@ -13106,7 +13223,7 @@
         </w:rPr>
         <w:t>Query Optimization Tips</w:t>
       </w:r>
-      <w:bookmarkEnd w:id="98"/>
+      <w:bookmarkEnd w:id="99"/>
     </w:p>
     <w:p>
       <w:pPr>
@@ -13115,7 +13232,7 @@
           <w:rFonts w:asciiTheme="minorHAnsi" w:cstheme="minorHAnsi"/>
         </w:rPr>
       </w:pPr>
-      <w:bookmarkStart w:id="99" w:name="bm_1_use_appropriate_indexes"/>
+      <w:bookmarkStart w:id="100" w:name="bm_1_use_appropriate_indexes"/>
       <w:r>
         <w:rPr>
           <w:rFonts w:asciiTheme="minorHAnsi" w:cstheme="minorHAnsi"/>
@@ -13124,7 +13241,7 @@
         </w:rPr>
         <w:t>1. Use Appropriate Indexes</w:t>
       </w:r>
-      <w:bookmarkEnd w:id="99"/>
+      <w:bookmarkEnd w:id="100"/>
     </w:p>
     <w:p>
       <w:pPr>
@@ -13220,7 +13337,7 @@
           <w:rFonts w:asciiTheme="minorHAnsi" w:cstheme="minorHAnsi"/>
         </w:rPr>
       </w:pPr>
-      <w:bookmarkStart w:id="100" w:name="bm_2_avoid_select"/>
+      <w:bookmarkStart w:id="101" w:name="bm_2_avoid_select"/>
       <w:r>
         <w:rPr>
           <w:rFonts w:asciiTheme="minorHAnsi" w:cstheme="minorHAnsi"/>
@@ -13229,7 +13346,7 @@
         </w:rPr>
         <w:t>2. Avoid SELECT *</w:t>
       </w:r>
-      <w:bookmarkEnd w:id="100"/>
+      <w:bookmarkEnd w:id="101"/>
     </w:p>
     <w:p>
       <w:pPr>
@@ -13281,7 +13398,7 @@
           <w:rFonts w:asciiTheme="minorHAnsi" w:cstheme="minorHAnsi"/>
         </w:rPr>
       </w:pPr>
-      <w:bookmarkStart w:id="101" w:name="bm_3_use_joins_instead_of_subquer_686809"/>
+      <w:bookmarkStart w:id="102" w:name="bm_3_use_joins_instead_of_subquer_686809"/>
       <w:r>
         <w:rPr>
           <w:rFonts w:asciiTheme="minorHAnsi" w:cstheme="minorHAnsi"/>
@@ -13290,7 +13407,7 @@
         </w:rPr>
         <w:t>3. Use Joins Instead of Subqueries (Usually)</w:t>
       </w:r>
-      <w:bookmarkEnd w:id="101"/>
+      <w:bookmarkEnd w:id="102"/>
     </w:p>
     <w:p>
       <w:pPr>
@@ -13372,7 +13489,7 @@
           <w:rFonts w:asciiTheme="minorHAnsi" w:cstheme="minorHAnsi"/>
         </w:rPr>
       </w:pPr>
-      <w:bookmarkStart w:id="102" w:name="bm_4_filter_early_where_before_group_by"/>
+      <w:bookmarkStart w:id="103" w:name="bm_4_filter_early_where_before_group_by"/>
       <w:r>
         <w:rPr>
           <w:rFonts w:asciiTheme="minorHAnsi" w:cstheme="minorHAnsi"/>
@@ -13381,7 +13498,7 @@
         </w:rPr>
         <w:t>4. Filter Early (WHERE before GROUP BY)</w:t>
       </w:r>
-      <w:bookmarkEnd w:id="102"/>
+      <w:bookmarkEnd w:id="103"/>
     </w:p>
     <w:p>
       <w:pPr>
@@ -13481,7 +13598,7 @@
           <w:rFonts w:asciiTheme="minorHAnsi" w:cstheme="minorHAnsi"/>
         </w:rPr>
       </w:pPr>
-      <w:bookmarkStart w:id="103" w:name="bm_5_use_limit_for_large_results"/>
+      <w:bookmarkStart w:id="104" w:name="bm_5_use_limit_for_large_results"/>
       <w:r>
         <w:rPr>
           <w:rFonts w:asciiTheme="minorHAnsi" w:cstheme="minorHAnsi"/>
@@ -13490,7 +13607,7 @@
         </w:rPr>
         <w:t>5. Use LIMIT for Large Results</w:t>
       </w:r>
-      <w:bookmarkEnd w:id="103"/>
+      <w:bookmarkEnd w:id="104"/>
     </w:p>
     <w:p>
       <w:pPr>
@@ -13541,7 +13658,7 @@
           <w:rFonts w:asciiTheme="minorHAnsi" w:cstheme="minorHAnsi"/>
         </w:rPr>
       </w:pPr>
-      <w:bookmarkStart w:id="104" w:name="bm_6_avoid_functions_on_indexed_columns"/>
+      <w:bookmarkStart w:id="105" w:name="bm_6_avoid_functions_on_indexed_columns"/>
       <w:r>
         <w:rPr>
           <w:rFonts w:asciiTheme="minorHAnsi" w:cstheme="minorHAnsi"/>
@@ -13550,7 +13667,7 @@
         </w:rPr>
         <w:t>6. Avoid Functions on Indexed Columns</w:t>
       </w:r>
-      <w:bookmarkEnd w:id="104"/>
+      <w:bookmarkEnd w:id="105"/>
     </w:p>
     <w:p>
       <w:pPr>
@@ -13608,7 +13725,7 @@
       <w:pPr>
         <w:spacing w:before="240" w:line="271" w:lineRule="auto"/>
       </w:pPr>
-      <w:bookmarkStart w:id="105" w:name="analyzing_query_performance"/>
+      <w:bookmarkStart w:id="106" w:name="analyzing_query_performance"/>
       <w:r>
         <w:rPr>
           <w:b/>
@@ -13616,13 +13733,13 @@
         </w:rPr>
         <w:t>Analyzing Query Performance</w:t>
       </w:r>
-      <w:bookmarkEnd w:id="105"/>
+      <w:bookmarkEnd w:id="106"/>
     </w:p>
     <w:p>
       <w:pPr>
         <w:spacing w:before="240" w:line="271" w:lineRule="auto"/>
       </w:pPr>
-      <w:bookmarkStart w:id="106" w:name="explain_statement"/>
+      <w:bookmarkStart w:id="107" w:name="explain_statement"/>
       <w:r>
         <w:rPr>
           <w:b/>
@@ -13630,7 +13747,7 @@
         </w:rPr>
         <w:t>EXPLAIN Statement</w:t>
       </w:r>
-      <w:bookmarkEnd w:id="106"/>
+      <w:bookmarkEnd w:id="107"/>
     </w:p>
     <w:p>
       <w:pPr>
@@ -13724,7 +13841,7 @@
       <w:pPr>
         <w:spacing w:before="240" w:line="271" w:lineRule="auto"/>
       </w:pPr>
-      <w:bookmarkStart w:id="107" w:name="explain_analyze"/>
+      <w:bookmarkStart w:id="108" w:name="explain_analyze"/>
       <w:r>
         <w:rPr>
           <w:b/>
@@ -13732,7 +13849,7 @@
         </w:rPr>
         <w:t>EXPLAIN ANALYZE</w:t>
       </w:r>
-      <w:bookmarkEnd w:id="107"/>
+      <w:bookmarkEnd w:id="108"/>
     </w:p>
     <w:p>
       <w:pPr>
@@ -13745,8 +13862,14 @@
     <w:p>
       <w:pPr>
         <w:spacing w:after="210"/>
-      </w:pPr>
-      <w:r>
+        <w:rPr>
+          <w:rFonts w:asciiTheme="minorHAnsi" w:cstheme="minorHAnsi"/>
+        </w:rPr>
+      </w:pPr>
+      <w:r>
+        <w:rPr>
+          <w:rFonts w:asciiTheme="minorHAnsi" w:cstheme="minorHAnsi"/>
+        </w:rPr>
         <w:t>EXPLAIN ANALYZE SELECT * FROM employees WHERE salary &gt; 50000;</w:t>
       </w:r>
     </w:p>
@@ -13756,7 +13879,7 @@
           <w:noProof/>
         </w:rPr>
         <w:pict>
-          <v:rect id="_x0000_i1037" alt="" style="width:434.5pt;height:.05pt;mso-width-percent:0;mso-height-percent:0;mso-width-percent:0;mso-height-percent:0" o:hralign="center" o:hrstd="t" o:hr="t"/>
+          <v:rect id="_x0000_i1049" alt="" style="width:434.5pt;height:.05pt;mso-width-percent:0;mso-height-percent:0;mso-width-percent:0;mso-height-percent:0" o:hralign="center" o:hrstd="t" o:hr="t"/>
         </w:pict>
       </w:r>
     </w:p>
@@ -13764,7 +13887,7 @@
       <w:pPr>
         <w:spacing w:before="240" w:line="288" w:lineRule="auto"/>
       </w:pPr>
-      <w:bookmarkStart w:id="108" w:name="chapter_12_views_procedures_functions"/>
+      <w:bookmarkStart w:id="109" w:name="chapter_12_views_procedures_functions"/>
       <w:r>
         <w:rPr>
           <w:b/>
@@ -13772,13 +13895,13 @@
         </w:rPr>
         <w:t>Chapter 12: Views, Procedures &amp; Functions</w:t>
       </w:r>
-      <w:bookmarkEnd w:id="108"/>
+      <w:bookmarkEnd w:id="109"/>
     </w:p>
     <w:p>
       <w:pPr>
         <w:spacing w:before="240" w:line="271" w:lineRule="auto"/>
       </w:pPr>
-      <w:bookmarkStart w:id="109" w:name="views"/>
+      <w:bookmarkStart w:id="110" w:name="views"/>
       <w:r>
         <w:rPr>
           <w:b/>
@@ -13786,7 +13909,7 @@
         </w:rPr>
         <w:t>Views</w:t>
       </w:r>
-      <w:bookmarkEnd w:id="109"/>
+      <w:bookmarkEnd w:id="110"/>
     </w:p>
     <w:p>
       <w:pPr>
@@ -13883,19 +14006,25 @@
     <w:p>
       <w:pPr>
         <w:spacing w:after="210"/>
-      </w:pPr>
-      <w:r>
-        <w:rPr>
-          <w:rFonts w:eastAsia="Georgia" w:hAnsi="Georgia" w:cs="Georgia"/>
+        <w:rPr>
+          <w:rFonts w:asciiTheme="minorHAnsi" w:cstheme="minorHAnsi"/>
+        </w:rPr>
+      </w:pPr>
+      <w:r>
+        <w:rPr>
+          <w:rFonts w:asciiTheme="minorHAnsi" w:eastAsia="Georgia" w:cstheme="minorHAnsi"/>
         </w:rPr>
         <w:t>SELECT * FROM high_earners;</w:t>
       </w:r>
       <w:r>
-        <w:br/>
-      </w:r>
-      <w:r>
-        <w:rPr>
-          <w:rFonts w:eastAsia="Georgia" w:hAnsi="Georgia" w:cs="Georgia"/>
+        <w:rPr>
+          <w:rFonts w:asciiTheme="minorHAnsi" w:cstheme="minorHAnsi"/>
+        </w:rPr>
+        <w:br/>
+      </w:r>
+      <w:r>
+        <w:rPr>
+          <w:rFonts w:asciiTheme="minorHAnsi" w:eastAsia="Georgia" w:cstheme="minorHAnsi"/>
         </w:rPr>
         <w:t>SELECT name FROM high_earners WHERE department_id = 2;</w:t>
       </w:r>
@@ -13971,7 +14100,7 @@
       <w:pPr>
         <w:spacing w:before="240" w:line="271" w:lineRule="auto"/>
       </w:pPr>
-      <w:bookmarkStart w:id="110" w:name="stored_procedures"/>
+      <w:bookmarkStart w:id="111" w:name="stored_procedures"/>
       <w:r>
         <w:rPr>
           <w:b/>
@@ -13979,7 +14108,7 @@
         </w:rPr>
         <w:t>Stored Procedures</w:t>
       </w:r>
-      <w:bookmarkEnd w:id="110"/>
+      <w:bookmarkEnd w:id="111"/>
     </w:p>
     <w:p>
       <w:pPr>
@@ -14417,7 +14546,7 @@
           <w:sz w:val="42"/>
         </w:rPr>
       </w:pPr>
-      <w:bookmarkStart w:id="111" w:name="functions"/>
+      <w:bookmarkStart w:id="112" w:name="functions"/>
     </w:p>
     <w:p>
       <w:pPr>
@@ -14549,7 +14678,7 @@
         </w:rPr>
         <w:t>Functions</w:t>
       </w:r>
-      <w:bookmarkEnd w:id="111"/>
+      <w:bookmarkEnd w:id="112"/>
     </w:p>
     <w:p>
       <w:pPr>
@@ -14923,7 +15052,7 @@
       <w:pPr>
         <w:spacing w:before="240" w:line="271" w:lineRule="auto"/>
       </w:pPr>
-      <w:bookmarkStart w:id="112" w:name="triggers"/>
+      <w:bookmarkStart w:id="113" w:name="triggers"/>
       <w:r>
         <w:rPr>
           <w:b/>
@@ -14931,7 +15060,7 @@
         </w:rPr>
         <w:t>Triggers</w:t>
       </w:r>
-      <w:bookmarkEnd w:id="112"/>
+      <w:bookmarkEnd w:id="113"/>
     </w:p>
     <w:p>
       <w:pPr>
@@ -15170,7 +15299,7 @@
           <w:lang w:val="en-IN" w:eastAsia="en-IN"/>
         </w:rPr>
         <w:pict>
-          <v:rect id="_x0000_i1060" style="width:0;height:1.5pt" o:hralign="center" o:hrstd="t" o:hr="t" fillcolor="#a0a0a0" stroked="f"/>
+          <v:rect id="_x0000_i1050" style="width:0;height:1.5pt" o:hralign="center" o:hrstd="t" o:hr="t" fillcolor="#a0a0a0" stroked="f"/>
         </w:pict>
       </w:r>
     </w:p>
@@ -15498,7 +15627,7 @@
           <w:lang w:val="en-IN" w:eastAsia="en-IN"/>
         </w:rPr>
         <w:pict>
-          <v:rect id="_x0000_i1061" style="width:0;height:1.5pt" o:hralign="center" o:hrstd="t" o:hr="t" fillcolor="#a0a0a0" stroked="f"/>
+          <v:rect id="_x0000_i1051" style="width:0;height:1.5pt" o:hralign="center" o:hrstd="t" o:hr="t" fillcolor="#a0a0a0" stroked="f"/>
         </w:pict>
       </w:r>
     </w:p>
@@ -15695,7 +15824,7 @@
           <w:lang w:val="en-IN" w:eastAsia="en-IN"/>
         </w:rPr>
         <w:pict>
-          <v:rect id="_x0000_i1062" style="width:0;height:1.5pt" o:hralign="center" o:hrstd="t" o:hr="t" fillcolor="#a0a0a0" stroked="f"/>
+          <v:rect id="_x0000_i1052" style="width:0;height:1.5pt" o:hralign="center" o:hrstd="t" o:hr="t" fillcolor="#a0a0a0" stroked="f"/>
         </w:pict>
       </w:r>
     </w:p>
@@ -15906,7 +16035,7 @@
           <w:lang w:val="en-IN" w:eastAsia="en-IN"/>
         </w:rPr>
         <w:pict>
-          <v:rect id="_x0000_i1063" style="width:0;height:1.5pt" o:hralign="center" o:hrstd="t" o:hr="t" fillcolor="#a0a0a0" stroked="f"/>
+          <v:rect id="_x0000_i1053" style="width:0;height:1.5pt" o:hralign="center" o:hrstd="t" o:hr="t" fillcolor="#a0a0a0" stroked="f"/>
         </w:pict>
       </w:r>
     </w:p>
@@ -16070,7 +16199,7 @@
           <w:lang w:val="en-IN" w:eastAsia="en-IN"/>
         </w:rPr>
         <w:pict>
-          <v:rect id="_x0000_i1064" style="width:0;height:1.5pt" o:hralign="center" o:hrstd="t" o:hr="t" fillcolor="#a0a0a0" stroked="f"/>
+          <v:rect id="_x0000_i1054" style="width:0;height:1.5pt" o:hralign="center" o:hrstd="t" o:hr="t" fillcolor="#a0a0a0" stroked="f"/>
         </w:pict>
       </w:r>
     </w:p>
@@ -16222,7 +16351,7 @@
           <w:lang w:val="en-IN" w:eastAsia="en-IN"/>
         </w:rPr>
         <w:pict>
-          <v:rect id="_x0000_i1065" style="width:0;height:1.5pt" o:hralign="center" o:hrstd="t" o:hr="t" fillcolor="#a0a0a0" stroked="f"/>
+          <v:rect id="_x0000_i1055" style="width:0;height:1.5pt" o:hralign="center" o:hrstd="t" o:hr="t" fillcolor="#a0a0a0" stroked="f"/>
         </w:pict>
       </w:r>
     </w:p>
@@ -16429,7 +16558,7 @@
           <w:lang w:val="en-IN" w:eastAsia="en-IN"/>
         </w:rPr>
         <w:pict>
-          <v:rect id="_x0000_i1066" style="width:0;height:1.5pt" o:hralign="center" o:hrstd="t" o:hr="t" fillcolor="#a0a0a0" stroked="f"/>
+          <v:rect id="_x0000_i1056" style="width:0;height:1.5pt" o:hralign="center" o:hrstd="t" o:hr="t" fillcolor="#a0a0a0" stroked="f"/>
         </w:pict>
       </w:r>
     </w:p>
@@ -16738,7 +16867,7 @@
           <w:lang w:val="en-IN" w:eastAsia="en-IN"/>
         </w:rPr>
         <w:pict>
-          <v:rect id="_x0000_i1067" style="width:0;height:1.5pt" o:hralign="center" o:hrstd="t" o:hr="t" fillcolor="#a0a0a0" stroked="f"/>
+          <v:rect id="_x0000_i1057" style="width:0;height:1.5pt" o:hralign="center" o:hrstd="t" o:hr="t" fillcolor="#a0a0a0" stroked="f"/>
         </w:pict>
       </w:r>
     </w:p>
@@ -17016,7 +17145,7 @@
           <w:lang w:val="en-IN" w:eastAsia="en-IN"/>
         </w:rPr>
         <w:pict>
-          <v:rect id="_x0000_i1068" style="width:0;height:1.5pt" o:hralign="center" o:hrstd="t" o:hr="t" fillcolor="#a0a0a0" stroked="f"/>
+          <v:rect id="_x0000_i1058" style="width:0;height:1.5pt" o:hralign="center" o:hrstd="t" o:hr="t" fillcolor="#a0a0a0" stroked="f"/>
         </w:pict>
       </w:r>
     </w:p>
@@ -17159,7 +17288,7 @@
           <w:lang w:val="en-IN" w:eastAsia="en-IN"/>
         </w:rPr>
         <w:pict>
-          <v:rect id="_x0000_i1069" style="width:0;height:1.5pt" o:hralign="center" o:hrstd="t" o:hr="t" fillcolor="#a0a0a0" stroked="f"/>
+          <v:rect id="_x0000_i1059" style="width:0;height:1.5pt" o:hralign="center" o:hrstd="t" o:hr="t" fillcolor="#a0a0a0" stroked="f"/>
         </w:pict>
       </w:r>
     </w:p>
@@ -17512,7 +17641,7 @@
           <w:lang w:val="en-IN" w:eastAsia="en-IN"/>
         </w:rPr>
         <w:pict>
-          <v:rect id="_x0000_i1054" style="width:0;height:1.5pt" o:hralign="center" o:hrstd="t" o:hr="t" fillcolor="#a0a0a0" stroked="f"/>
+          <v:rect id="_x0000_i1060" style="width:0;height:1.5pt" o:hralign="center" o:hrstd="t" o:hr="t" fillcolor="#a0a0a0" stroked="f"/>
         </w:pict>
       </w:r>
     </w:p>
@@ -17768,7 +17897,7 @@
           <w:lang w:val="en-IN" w:eastAsia="en-IN"/>
         </w:rPr>
         <w:pict>
-          <v:rect id="_x0000_i1055" style="width:0;height:1.5pt" o:hralign="center" o:hrstd="t" o:hr="t" fillcolor="#a0a0a0" stroked="f"/>
+          <v:rect id="_x0000_i1061" style="width:0;height:1.5pt" o:hralign="center" o:hrstd="t" o:hr="t" fillcolor="#a0a0a0" stroked="f"/>
         </w:pict>
       </w:r>
     </w:p>
@@ -18031,7 +18160,7 @@
           <w:lang w:val="en-IN" w:eastAsia="en-IN"/>
         </w:rPr>
         <w:pict>
-          <v:rect id="_x0000_i1056" style="width:0;height:1.5pt" o:hralign="center" o:hrstd="t" o:hr="t" fillcolor="#a0a0a0" stroked="f"/>
+          <v:rect id="_x0000_i1062" style="width:0;height:1.5pt" o:hralign="center" o:hrstd="t" o:hr="t" fillcolor="#a0a0a0" stroked="f"/>
         </w:pict>
       </w:r>
     </w:p>
@@ -18252,7 +18381,7 @@
           <w:lang w:val="en-IN" w:eastAsia="en-IN"/>
         </w:rPr>
         <w:pict>
-          <v:rect id="_x0000_i1057" style="width:0;height:1.5pt" o:hralign="center" o:hrstd="t" o:hr="t" fillcolor="#a0a0a0" stroked="f"/>
+          <v:rect id="_x0000_i1063" style="width:0;height:1.5pt" o:hralign="center" o:hrstd="t" o:hr="t" fillcolor="#a0a0a0" stroked="f"/>
         </w:pict>
       </w:r>
     </w:p>
@@ -18776,7 +18905,7 @@
           <w:lang w:val="en-IN" w:eastAsia="en-IN"/>
         </w:rPr>
         <w:pict>
-          <v:rect id="_x0000_i1058" style="width:0;height:1.5pt" o:hralign="center" o:hrstd="t" o:hr="t" fillcolor="#a0a0a0" stroked="f"/>
+          <v:rect id="_x0000_i1064" style="width:0;height:1.5pt" o:hralign="center" o:hrstd="t" o:hr="t" fillcolor="#a0a0a0" stroked="f"/>
         </w:pict>
       </w:r>
     </w:p>
@@ -18985,7 +19114,7 @@
           <w:lang w:val="en-IN" w:eastAsia="en-IN"/>
         </w:rPr>
         <w:pict>
-          <v:rect id="_x0000_i1059" style="width:0;height:1.5pt" o:hralign="center" o:hrstd="t" o:hr="t" fillcolor="#a0a0a0" stroked="f"/>
+          <v:rect id="_x0000_i1065" style="width:0;height:1.5pt" o:hralign="center" o:hrstd="t" o:hr="t" fillcolor="#a0a0a0" stroked="f"/>
         </w:pict>
       </w:r>
     </w:p>
@@ -19413,7 +19542,7 @@
           <w:noProof/>
         </w:rPr>
         <w:pict>
-          <v:rect id="_x0000_i1038" alt="" style="width:434.5pt;height:.05pt;mso-width-percent:0;mso-height-percent:0;mso-width-percent:0;mso-height-percent:0" o:hralign="center" o:hrstd="t" o:hr="t"/>
+          <v:rect id="_x0000_i1066" alt="" style="width:434.5pt;height:.05pt;mso-width-percent:0;mso-height-percent:0;mso-width-percent:0;mso-height-percent:0" o:hralign="center" o:hrstd="t" o:hr="t"/>
         </w:pict>
       </w:r>
     </w:p>
@@ -19421,7 +19550,7 @@
       <w:pPr>
         <w:spacing w:before="240" w:line="288" w:lineRule="auto"/>
       </w:pPr>
-      <w:bookmarkStart w:id="113" w:name="chapter_13_transactions_acid_properties"/>
+      <w:bookmarkStart w:id="114" w:name="chapter_13_transactions_acid_properties"/>
       <w:r>
         <w:rPr>
           <w:b/>
@@ -19429,13 +19558,13 @@
         </w:rPr>
         <w:t>Chapter 13: Transactions &amp; ACID Properties</w:t>
       </w:r>
-      <w:bookmarkEnd w:id="113"/>
+      <w:bookmarkEnd w:id="114"/>
     </w:p>
     <w:p>
       <w:pPr>
         <w:spacing w:before="240" w:line="271" w:lineRule="auto"/>
       </w:pPr>
-      <w:bookmarkStart w:id="114" w:name="commit_and_rollback"/>
+      <w:bookmarkStart w:id="115" w:name="commit_and_rollback"/>
       <w:r>
         <w:rPr>
           <w:b/>
@@ -19443,7 +19572,7 @@
         </w:rPr>
         <w:t>COMMIT and ROLLBACK</w:t>
       </w:r>
-      <w:bookmarkEnd w:id="114"/>
+      <w:bookmarkEnd w:id="115"/>
     </w:p>
     <w:p>
       <w:pPr>
@@ -19604,7 +19733,7 @@
       <w:pPr>
         <w:spacing w:before="240" w:line="271" w:lineRule="auto"/>
       </w:pPr>
-      <w:bookmarkStart w:id="115" w:name="savepoint"/>
+      <w:bookmarkStart w:id="116" w:name="savepoint"/>
       <w:r>
         <w:rPr>
           <w:b/>
@@ -19612,7 +19741,7 @@
         </w:rPr>
         <w:t>SAVEPOINT</w:t>
       </w:r>
-      <w:bookmarkEnd w:id="115"/>
+      <w:bookmarkEnd w:id="116"/>
     </w:p>
     <w:p>
       <w:pPr>
@@ -19716,7 +19845,7 @@
       <w:pPr>
         <w:spacing w:before="240" w:line="271" w:lineRule="auto"/>
       </w:pPr>
-      <w:bookmarkStart w:id="116" w:name="acid_properties"/>
+      <w:bookmarkStart w:id="117" w:name="acid_properties"/>
       <w:r>
         <w:rPr>
           <w:b/>
@@ -19724,7 +19853,7 @@
         </w:rPr>
         <w:t>ACID Properties</w:t>
       </w:r>
-      <w:bookmarkEnd w:id="116"/>
+      <w:bookmarkEnd w:id="117"/>
     </w:p>
     <w:p>
       <w:pPr>
@@ -19744,7 +19873,7 @@
       <w:pPr>
         <w:spacing w:before="240" w:line="271" w:lineRule="auto"/>
       </w:pPr>
-      <w:bookmarkStart w:id="117" w:name="atomicity"/>
+      <w:bookmarkStart w:id="118" w:name="atomicity"/>
       <w:r>
         <w:rPr>
           <w:b/>
@@ -19752,7 +19881,7 @@
         </w:rPr>
         <w:t>Atomicity</w:t>
       </w:r>
-      <w:bookmarkEnd w:id="117"/>
+      <w:bookmarkEnd w:id="118"/>
     </w:p>
     <w:p>
       <w:pPr>
@@ -19841,7 +19970,7 @@
       <w:pPr>
         <w:spacing w:before="240" w:line="271" w:lineRule="auto"/>
       </w:pPr>
-      <w:bookmarkStart w:id="118" w:name="consistency"/>
+      <w:bookmarkStart w:id="119" w:name="consistency"/>
       <w:r>
         <w:rPr>
           <w:b/>
@@ -19849,7 +19978,7 @@
         </w:rPr>
         <w:t>Consistency</w:t>
       </w:r>
-      <w:bookmarkEnd w:id="118"/>
+      <w:bookmarkEnd w:id="119"/>
     </w:p>
     <w:p>
       <w:pPr>
@@ -19910,7 +20039,7 @@
       <w:pPr>
         <w:spacing w:before="240" w:line="271" w:lineRule="auto"/>
       </w:pPr>
-      <w:bookmarkStart w:id="119" w:name="isolation"/>
+      <w:bookmarkStart w:id="120" w:name="isolation"/>
       <w:r>
         <w:rPr>
           <w:b/>
@@ -19918,7 +20047,7 @@
         </w:rPr>
         <w:t>Isolation</w:t>
       </w:r>
-      <w:bookmarkEnd w:id="119"/>
+      <w:bookmarkEnd w:id="120"/>
     </w:p>
     <w:p>
       <w:pPr>
@@ -20016,7 +20145,7 @@
           <w:sz w:val="33"/>
         </w:rPr>
       </w:pPr>
-      <w:bookmarkStart w:id="120" w:name="durability"/>
+      <w:bookmarkStart w:id="121" w:name="durability"/>
     </w:p>
     <w:p>
       <w:pPr>
@@ -20136,7 +20265,7 @@
           <w:lang w:val="en-IN" w:eastAsia="en-IN"/>
         </w:rPr>
         <w:pict>
-          <v:rect id="_x0000_i1043" style="width:0;height:1.5pt" o:hralign="center" o:hrstd="t" o:hr="t" fillcolor="#a0a0a0" stroked="f"/>
+          <v:rect id="_x0000_i1067" style="width:0;height:1.5pt" o:hralign="center" o:hrstd="t" o:hr="t" fillcolor="#a0a0a0" stroked="f"/>
         </w:pict>
       </w:r>
     </w:p>
@@ -20359,7 +20488,7 @@
           <w:lang w:val="en-IN" w:eastAsia="en-IN"/>
         </w:rPr>
         <w:pict>
-          <v:rect id="_x0000_i1044" style="width:0;height:1.5pt" o:hralign="center" o:hrstd="t" o:hr="t" fillcolor="#a0a0a0" stroked="f"/>
+          <v:rect id="_x0000_i1068" style="width:0;height:1.5pt" o:hralign="center" o:hrstd="t" o:hr="t" fillcolor="#a0a0a0" stroked="f"/>
         </w:pict>
       </w:r>
     </w:p>
@@ -20491,7 +20620,7 @@
           <w:lang w:val="en-IN" w:eastAsia="en-IN"/>
         </w:rPr>
         <w:pict>
-          <v:rect id="_x0000_i1045" style="width:0;height:1.5pt" o:hralign="center" o:hrstd="t" o:hr="t" fillcolor="#a0a0a0" stroked="f"/>
+          <v:rect id="_x0000_i1069" style="width:0;height:1.5pt" o:hralign="center" o:hrstd="t" o:hr="t" fillcolor="#a0a0a0" stroked="f"/>
         </w:pict>
       </w:r>
     </w:p>
@@ -20651,7 +20780,7 @@
           <w:lang w:val="en-IN" w:eastAsia="en-IN"/>
         </w:rPr>
         <w:pict>
-          <v:rect id="_x0000_i1046" style="width:0;height:1.5pt" o:hralign="center" o:hrstd="t" o:hr="t" fillcolor="#a0a0a0" stroked="f"/>
+          <v:rect id="_x0000_i1070" style="width:0;height:1.5pt" o:hralign="center" o:hrstd="t" o:hr="t" fillcolor="#a0a0a0" stroked="f"/>
         </w:pict>
       </w:r>
     </w:p>
@@ -20821,7 +20950,7 @@
           <w:lang w:val="en-IN" w:eastAsia="en-IN"/>
         </w:rPr>
         <w:pict>
-          <v:rect id="_x0000_i1047" style="width:0;height:1.5pt" o:hralign="center" o:hrstd="t" o:hr="t" fillcolor="#a0a0a0" stroked="f"/>
+          <v:rect id="_x0000_i1071" style="width:0;height:1.5pt" o:hralign="center" o:hrstd="t" o:hr="t" fillcolor="#a0a0a0" stroked="f"/>
         </w:pict>
       </w:r>
     </w:p>
@@ -20930,7 +21059,7 @@
           <w:lang w:val="en-IN" w:eastAsia="en-IN"/>
         </w:rPr>
         <w:pict>
-          <v:rect id="_x0000_i1048" style="width:0;height:1.5pt" o:hralign="center" o:hrstd="t" o:hr="t" fillcolor="#a0a0a0" stroked="f"/>
+          <v:rect id="_x0000_i1072" style="width:0;height:1.5pt" o:hralign="center" o:hrstd="t" o:hr="t" fillcolor="#a0a0a0" stroked="f"/>
         </w:pict>
       </w:r>
     </w:p>
@@ -21305,7 +21434,7 @@
           <w:lang w:val="en-IN" w:eastAsia="en-IN"/>
         </w:rPr>
         <w:pict>
-          <v:rect id="_x0000_i1049" style="width:0;height:1.5pt" o:hralign="center" o:hrstd="t" o:hr="t" fillcolor="#a0a0a0" stroked="f"/>
+          <v:rect id="_x0000_i1073" style="width:0;height:1.5pt" o:hralign="center" o:hrstd="t" o:hr="t" fillcolor="#a0a0a0" stroked="f"/>
         </w:pict>
       </w:r>
     </w:p>
@@ -21686,7 +21815,7 @@
           <w:lang w:val="en-IN" w:eastAsia="en-IN"/>
         </w:rPr>
         <w:pict>
-          <v:rect id="_x0000_i1050" style="width:0;height:1.5pt" o:hralign="center" o:hrstd="t" o:hr="t" fillcolor="#a0a0a0" stroked="f"/>
+          <v:rect id="_x0000_i1074" style="width:0;height:1.5pt" o:hralign="center" o:hrstd="t" o:hr="t" fillcolor="#a0a0a0" stroked="f"/>
         </w:pict>
       </w:r>
     </w:p>
@@ -22057,7 +22186,7 @@
           <w:lang w:val="en-IN" w:eastAsia="en-IN"/>
         </w:rPr>
         <w:pict>
-          <v:rect id="_x0000_i1051" style="width:0;height:1.5pt" o:hralign="center" o:hrstd="t" o:hr="t" fillcolor="#a0a0a0" stroked="f"/>
+          <v:rect id="_x0000_i1075" style="width:0;height:1.5pt" o:hralign="center" o:hrstd="t" o:hr="t" fillcolor="#a0a0a0" stroked="f"/>
         </w:pict>
       </w:r>
     </w:p>
@@ -22403,7 +22532,7 @@
           <w:lang w:val="en-IN" w:eastAsia="en-IN"/>
         </w:rPr>
         <w:pict>
-          <v:rect id="_x0000_i1052" style="width:0;height:1.5pt" o:hralign="center" o:hrstd="t" o:hr="t" fillcolor="#a0a0a0" stroked="f"/>
+          <v:rect id="_x0000_i1076" style="width:0;height:1.5pt" o:hralign="center" o:hrstd="t" o:hr="t" fillcolor="#a0a0a0" stroked="f"/>
         </w:pict>
       </w:r>
     </w:p>
@@ -23009,7 +23138,7 @@
           <w:lang w:val="en-IN" w:eastAsia="en-IN"/>
         </w:rPr>
         <w:pict>
-          <v:rect id="_x0000_i1053" style="width:0;height:1.5pt" o:hralign="center" o:hrstd="t" o:hr="t" fillcolor="#a0a0a0" stroked="f"/>
+          <v:rect id="_x0000_i1077" style="width:0;height:1.5pt" o:hralign="center" o:hrstd="t" o:hr="t" fillcolor="#a0a0a0" stroked="f"/>
         </w:pict>
       </w:r>
     </w:p>
@@ -23120,7 +23249,7 @@
         </w:rPr>
         <w:t>Durability</w:t>
       </w:r>
-      <w:bookmarkEnd w:id="120"/>
+      <w:bookmarkEnd w:id="121"/>
     </w:p>
     <w:p>
       <w:pPr>
@@ -23151,7 +23280,7 @@
           <w:noProof/>
         </w:rPr>
         <w:pict>
-          <v:rect id="_x0000_i1039" alt="" style="width:434.5pt;height:.05pt;mso-width-percent:0;mso-height-percent:0;mso-width-percent:0;mso-height-percent:0" o:hralign="center" o:hrstd="t" o:hr="t"/>
+          <v:rect id="_x0000_i1078" alt="" style="width:434.5pt;height:.05pt;mso-width-percent:0;mso-height-percent:0;mso-width-percent:0;mso-height-percent:0" o:hralign="center" o:hrstd="t" o:hr="t"/>
         </w:pict>
       </w:r>
     </w:p>
@@ -23159,7 +23288,7 @@
       <w:pPr>
         <w:spacing w:before="240" w:line="288" w:lineRule="auto"/>
       </w:pPr>
-      <w:bookmarkStart w:id="121" w:name="chapter_14_sql_for_analytics_reporting"/>
+      <w:bookmarkStart w:id="122" w:name="chapter_14_sql_for_analytics_reporting"/>
       <w:r>
         <w:rPr>
           <w:b/>
@@ -23167,13 +23296,13 @@
         </w:rPr>
         <w:t>Chapter 14: SQL for Analytics &amp; Reporting</w:t>
       </w:r>
-      <w:bookmarkEnd w:id="121"/>
+      <w:bookmarkEnd w:id="122"/>
     </w:p>
     <w:p>
       <w:pPr>
         <w:spacing w:before="240" w:line="271" w:lineRule="auto"/>
       </w:pPr>
-      <w:bookmarkStart w:id="122" w:name="window_functions"/>
+      <w:bookmarkStart w:id="123" w:name="window_functions"/>
       <w:r>
         <w:rPr>
           <w:b/>
@@ -23181,7 +23310,7 @@
         </w:rPr>
         <w:t>Window Functions</w:t>
       </w:r>
-      <w:bookmarkEnd w:id="122"/>
+      <w:bookmarkEnd w:id="123"/>
     </w:p>
     <w:p>
       <w:pPr>
@@ -23212,7 +23341,7 @@
       <w:pPr>
         <w:spacing w:before="240" w:line="271" w:lineRule="auto"/>
       </w:pPr>
-      <w:bookmarkStart w:id="123" w:name="row_number"/>
+      <w:bookmarkStart w:id="124" w:name="row_number"/>
       <w:r>
         <w:rPr>
           <w:rFonts w:eastAsia="Georgia" w:hAnsi="Georgia" w:cs="Georgia"/>
@@ -23221,7 +23350,7 @@
         </w:rPr>
         <w:t>ROW_NUMBER()</w:t>
       </w:r>
-      <w:bookmarkEnd w:id="123"/>
+      <w:bookmarkEnd w:id="124"/>
     </w:p>
     <w:p>
       <w:pPr>
@@ -23289,7 +23418,7 @@
       <w:pPr>
         <w:spacing w:before="240" w:line="271" w:lineRule="auto"/>
       </w:pPr>
-      <w:bookmarkStart w:id="124" w:name="rank"/>
+      <w:bookmarkStart w:id="125" w:name="rank"/>
       <w:r>
         <w:rPr>
           <w:b/>
@@ -23297,7 +23426,7 @@
         </w:rPr>
         <w:t>RANK()</w:t>
       </w:r>
-      <w:bookmarkEnd w:id="124"/>
+      <w:bookmarkEnd w:id="125"/>
     </w:p>
     <w:p>
       <w:pPr>
@@ -23412,7 +23541,7 @@
           <w:noProof/>
         </w:rPr>
       </w:pPr>
-      <w:bookmarkStart w:id="125" w:name="dense_rank"/>
+      <w:bookmarkStart w:id="126" w:name="dense_rank"/>
       <w:r>
         <w:rPr>
           <w:rFonts w:eastAsia="Georgia" w:hAnsi="Georgia" w:cs="Georgia"/>
@@ -23422,7 +23551,7 @@
         </w:rPr>
         <w:t>DENSE_RANK()</w:t>
       </w:r>
-      <w:bookmarkEnd w:id="125"/>
+      <w:bookmarkEnd w:id="126"/>
     </w:p>
     <w:p>
       <w:pPr>
@@ -23485,7 +23614,7 @@
       <w:pPr>
         <w:spacing w:before="240" w:line="271" w:lineRule="auto"/>
       </w:pPr>
-      <w:bookmarkStart w:id="126" w:name="lag_and_lead"/>
+      <w:bookmarkStart w:id="127" w:name="lag_and_lead"/>
       <w:r>
         <w:rPr>
           <w:b/>
@@ -23493,7 +23622,7 @@
         </w:rPr>
         <w:t>LAG() and LEAD()</w:t>
       </w:r>
-      <w:bookmarkEnd w:id="126"/>
+      <w:bookmarkEnd w:id="127"/>
     </w:p>
     <w:p>
       <w:pPr>
@@ -23566,7 +23695,7 @@
       <w:pPr>
         <w:spacing w:before="240" w:line="271" w:lineRule="auto"/>
       </w:pPr>
-      <w:bookmarkStart w:id="127" w:name="running_total"/>
+      <w:bookmarkStart w:id="128" w:name="running_total"/>
       <w:r>
         <w:rPr>
           <w:b/>
@@ -23574,7 +23703,7 @@
         </w:rPr>
         <w:t>Running Total</w:t>
       </w:r>
-      <w:bookmarkEnd w:id="127"/>
+      <w:bookmarkEnd w:id="128"/>
     </w:p>
     <w:p>
       <w:pPr>
@@ -23628,7 +23757,7 @@
       <w:pPr>
         <w:spacing w:before="240" w:line="271" w:lineRule="auto"/>
       </w:pPr>
-      <w:bookmarkStart w:id="128" w:name="partition_by"/>
+      <w:bookmarkStart w:id="129" w:name="partition_by"/>
       <w:r>
         <w:rPr>
           <w:b/>
@@ -23636,7 +23765,7 @@
         </w:rPr>
         <w:t>Partition By</w:t>
       </w:r>
-      <w:bookmarkEnd w:id="128"/>
+      <w:bookmarkEnd w:id="129"/>
     </w:p>
     <w:p>
       <w:pPr>
@@ -23736,7 +23865,7 @@
       <w:pPr>
         <w:spacing w:before="240" w:line="271" w:lineRule="auto"/>
       </w:pPr>
-      <w:bookmarkStart w:id="129" w:name="use_cases_in_bi_tools"/>
+      <w:bookmarkStart w:id="130" w:name="use_cases_in_bi_tools"/>
       <w:r>
         <w:rPr>
           <w:b/>
@@ -23744,13 +23873,13 @@
         </w:rPr>
         <w:t>Use Cases in BI Tools</w:t>
       </w:r>
-      <w:bookmarkEnd w:id="129"/>
+      <w:bookmarkEnd w:id="130"/>
     </w:p>
     <w:p>
       <w:pPr>
         <w:spacing w:before="240" w:line="271" w:lineRule="auto"/>
       </w:pPr>
-      <w:bookmarkStart w:id="130" w:name="year_over_year_comparison"/>
+      <w:bookmarkStart w:id="131" w:name="year_over_year_comparison"/>
       <w:r>
         <w:rPr>
           <w:b/>
@@ -23758,7 +23887,7 @@
         </w:rPr>
         <w:t>Year-over-Year Comparison</w:t>
       </w:r>
-      <w:bookmarkEnd w:id="130"/>
+      <w:bookmarkEnd w:id="131"/>
     </w:p>
     <w:p>
       <w:pPr>
@@ -23842,7 +23971,7 @@
       <w:pPr>
         <w:spacing w:before="240" w:line="271" w:lineRule="auto"/>
       </w:pPr>
-      <w:bookmarkStart w:id="131" w:name="sales_ranking_by_region"/>
+      <w:bookmarkStart w:id="132" w:name="sales_ranking_by_region"/>
       <w:r>
         <w:rPr>
           <w:b/>
@@ -23850,7 +23979,7 @@
         </w:rPr>
         <w:t>Sales Ranking by Region</w:t>
       </w:r>
-      <w:bookmarkEnd w:id="131"/>
+      <w:bookmarkEnd w:id="132"/>
     </w:p>
     <w:p>
       <w:pPr>
@@ -23927,7 +24056,7 @@
       <w:pPr>
         <w:spacing w:before="240" w:line="271" w:lineRule="auto"/>
       </w:pPr>
-      <w:bookmarkStart w:id="132" w:name="percentile_calculation"/>
+      <w:bookmarkStart w:id="133" w:name="percentile_calculation"/>
       <w:r>
         <w:rPr>
           <w:b/>
@@ -23935,7 +24064,7 @@
         </w:rPr>
         <w:t>Percentile Calculation</w:t>
       </w:r>
-      <w:bookmarkEnd w:id="132"/>
+      <w:bookmarkEnd w:id="133"/>
     </w:p>
     <w:p>
       <w:pPr>
@@ -23991,7 +24120,7 @@
           <w:noProof/>
         </w:rPr>
         <w:pict>
-          <v:rect id="_x0000_i1040" alt="" style="width:434.5pt;height:.05pt;mso-width-percent:0;mso-height-percent:0;mso-width-percent:0;mso-height-percent:0" o:hralign="center" o:hrstd="t" o:hr="t"/>
+          <v:rect id="_x0000_i1079" alt="" style="width:434.5pt;height:.05pt;mso-width-percent:0;mso-height-percent:0;mso-width-percent:0;mso-height-percent:0" o:hralign="center" o:hrstd="t" o:hr="t"/>
         </w:pict>
       </w:r>
     </w:p>
@@ -23999,7 +24128,7 @@
       <w:pPr>
         <w:spacing w:before="240" w:line="288" w:lineRule="auto"/>
       </w:pPr>
-      <w:bookmarkStart w:id="133" w:name="chapter_15_sql_interview_question_5c76f6"/>
+      <w:bookmarkStart w:id="134" w:name="chapter_15_sql_interview_question_5c76f6"/>
       <w:r>
         <w:rPr>
           <w:b/>
@@ -24007,13 +24136,13 @@
         </w:rPr>
         <w:t>Chapter 15: SQL Interview Questions &amp; Scenarios</w:t>
       </w:r>
-      <w:bookmarkEnd w:id="133"/>
+      <w:bookmarkEnd w:id="134"/>
     </w:p>
     <w:p>
       <w:pPr>
         <w:spacing w:before="240" w:line="271" w:lineRule="auto"/>
       </w:pPr>
-      <w:bookmarkStart w:id="134" w:name="common_interview_questions"/>
+      <w:bookmarkStart w:id="135" w:name="common_interview_questions"/>
       <w:r>
         <w:rPr>
           <w:b/>
@@ -24021,13 +24150,13 @@
         </w:rPr>
         <w:t>Common Interview Questions</w:t>
       </w:r>
-      <w:bookmarkEnd w:id="134"/>
+      <w:bookmarkEnd w:id="135"/>
     </w:p>
     <w:p>
       <w:pPr>
         <w:spacing w:before="240" w:line="271" w:lineRule="auto"/>
       </w:pPr>
-      <w:bookmarkStart w:id="135" w:name="question_1_second_highest_salary"/>
+      <w:bookmarkStart w:id="136" w:name="question_1_second_highest_salary"/>
       <w:r>
         <w:rPr>
           <w:b/>
@@ -24035,7 +24164,7 @@
         </w:rPr>
         <w:t>Question 1: Second Highest Salary</w:t>
       </w:r>
-      <w:bookmarkEnd w:id="135"/>
+      <w:bookmarkEnd w:id="136"/>
     </w:p>
     <w:p>
       <w:pPr>
@@ -24086,8 +24215,6 @@
         </w:rPr>
         <w:t>SELECT DISTINCT salary</w:t>
       </w:r>
-      <w:bookmarkStart w:id="136" w:name="_GoBack"/>
-      <w:bookmarkEnd w:id="136"/>
       <w:r>
         <w:rPr>
           <w:rFonts w:asciiTheme="minorHAnsi" w:cstheme="minorHAnsi"/>
@@ -25456,7 +25583,7 @@
           <w:noProof/>
         </w:rPr>
         <w:pict>
-          <v:rect id="_x0000_i1041" alt="" style="width:434.5pt;height:.05pt;mso-width-percent:0;mso-height-percent:0;mso-width-percent:0;mso-height-percent:0" o:hralign="center" o:hrstd="t" o:hr="t"/>
+          <v:rect id="_x0000_i1080" alt="" style="width:434.5pt;height:.05pt;mso-width-percent:0;mso-height-percent:0;mso-width-percent:0;mso-height-percent:0" o:hralign="center" o:hrstd="t" o:hr="t"/>
         </w:pict>
       </w:r>
     </w:p>
@@ -25698,7 +25825,7 @@
           <w:noProof/>
         </w:rPr>
         <w:pict>
-          <v:rect id="_x0000_i1042" alt="" style="width:434.5pt;height:.05pt;mso-width-percent:0;mso-height-percent:0;mso-width-percent:0;mso-height-percent:0" o:hralign="center" o:hrstd="t" o:hr="t"/>
+          <v:rect id="_x0000_i1081" alt="" style="width:434.5pt;height:.05pt;mso-width-percent:0;mso-height-percent:0;mso-width-percent:0;mso-height-percent:0" o:hralign="center" o:hrstd="t" o:hr="t"/>
         </w:pict>
       </w:r>
     </w:p>

</xml_diff>